<commit_message>
Implement Kafka Producers #59
</commit_message>
<xml_diff>
--- a/Documents/Auto Rentals - Final Report.docx
+++ b/Documents/Auto Rentals - Final Report.docx
@@ -35,7 +35,31 @@
           <w:sz w:val="32"/>
           <w:szCs w:val="32"/>
         </w:rPr>
-        <w:t>Phase 1: High-Level System Design</w:t>
+        <w:t xml:space="preserve">Phase </w:t>
+      </w:r>
+      <w:r>
+        <w:rPr>
+          <w:rFonts w:asciiTheme="majorBidi" w:hAnsiTheme="majorBidi" w:cstheme="majorBidi"/>
+          <w:sz w:val="32"/>
+          <w:szCs w:val="32"/>
+        </w:rPr>
+        <w:t>2</w:t>
+      </w:r>
+      <w:r>
+        <w:rPr>
+          <w:rFonts w:asciiTheme="majorBidi" w:hAnsiTheme="majorBidi" w:cstheme="majorBidi"/>
+          <w:sz w:val="32"/>
+          <w:szCs w:val="32"/>
+        </w:rPr>
+        <w:t xml:space="preserve">: </w:t>
+      </w:r>
+      <w:r>
+        <w:rPr>
+          <w:rFonts w:asciiTheme="majorBidi" w:hAnsiTheme="majorBidi" w:cstheme="majorBidi"/>
+          <w:sz w:val="32"/>
+          <w:szCs w:val="32"/>
+        </w:rPr>
+        <w:t xml:space="preserve">Final Implementation </w:t>
       </w:r>
     </w:p>
     <w:p>
@@ -156,7 +180,25 @@
           <w:sz w:val="28"/>
           <w:szCs w:val="28"/>
         </w:rPr>
-        <w:t xml:space="preserve">Vehicle listing management (CRUD) </w:t>
+        <w:t xml:space="preserve">Vehicle </w:t>
+      </w:r>
+      <w:proofErr w:type="gramStart"/>
+      <w:r>
+        <w:rPr>
+          <w:rFonts w:asciiTheme="majorBidi" w:hAnsiTheme="majorBidi" w:cstheme="majorBidi"/>
+          <w:sz w:val="28"/>
+          <w:szCs w:val="28"/>
+        </w:rPr>
+        <w:t>listing</w:t>
+      </w:r>
+      <w:proofErr w:type="gramEnd"/>
+      <w:r>
+        <w:rPr>
+          <w:rFonts w:asciiTheme="majorBidi" w:hAnsiTheme="majorBidi" w:cstheme="majorBidi"/>
+          <w:sz w:val="28"/>
+          <w:szCs w:val="28"/>
+        </w:rPr>
+        <w:t xml:space="preserve"> management (CRUD) </w:t>
       </w:r>
     </w:p>
     <w:p>
@@ -521,7 +563,16 @@
           <w:sz w:val="28"/>
           <w:szCs w:val="28"/>
         </w:rPr>
-        <w:t xml:space="preserve">As a user, </w:t>
+        <w:t>As a user</w:t>
+      </w:r>
+      <w:proofErr w:type="gramStart"/>
+      <w:r>
+        <w:rPr>
+          <w:rFonts w:asciiTheme="majorBidi" w:hAnsiTheme="majorBidi" w:cstheme="majorBidi"/>
+          <w:sz w:val="28"/>
+          <w:szCs w:val="28"/>
+        </w:rPr>
+        <w:t xml:space="preserve">, </w:t>
       </w:r>
       <w:r>
         <w:rPr>
@@ -537,7 +588,16 @@
           <w:sz w:val="28"/>
           <w:szCs w:val="28"/>
         </w:rPr>
-        <w:t xml:space="preserve">I want to register/login </w:t>
+        <w:t>I</w:t>
+      </w:r>
+      <w:proofErr w:type="gramEnd"/>
+      <w:r>
+        <w:rPr>
+          <w:rFonts w:asciiTheme="majorBidi" w:hAnsiTheme="majorBidi" w:cstheme="majorBidi"/>
+          <w:sz w:val="28"/>
+          <w:szCs w:val="28"/>
+        </w:rPr>
+        <w:t xml:space="preserve"> want to register/login </w:t>
       </w:r>
       <w:r>
         <w:rPr>
@@ -575,7 +635,16 @@
           <w:sz w:val="28"/>
           <w:szCs w:val="28"/>
         </w:rPr>
-        <w:t xml:space="preserve">As an owner, </w:t>
+        <w:t>As an owner</w:t>
+      </w:r>
+      <w:proofErr w:type="gramStart"/>
+      <w:r>
+        <w:rPr>
+          <w:rFonts w:asciiTheme="majorBidi" w:hAnsiTheme="majorBidi" w:cstheme="majorBidi"/>
+          <w:sz w:val="28"/>
+          <w:szCs w:val="28"/>
+        </w:rPr>
+        <w:t xml:space="preserve">, </w:t>
       </w:r>
       <w:r>
         <w:rPr>
@@ -591,7 +660,16 @@
           <w:sz w:val="28"/>
           <w:szCs w:val="28"/>
         </w:rPr>
-        <w:t xml:space="preserve">I want to list my car </w:t>
+        <w:t>I</w:t>
+      </w:r>
+      <w:proofErr w:type="gramEnd"/>
+      <w:r>
+        <w:rPr>
+          <w:rFonts w:asciiTheme="majorBidi" w:hAnsiTheme="majorBidi" w:cstheme="majorBidi"/>
+          <w:sz w:val="28"/>
+          <w:szCs w:val="28"/>
+        </w:rPr>
+        <w:t xml:space="preserve"> want to list my car </w:t>
       </w:r>
       <w:r>
         <w:rPr>
@@ -629,7 +707,16 @@
           <w:sz w:val="28"/>
           <w:szCs w:val="28"/>
         </w:rPr>
-        <w:t xml:space="preserve">As a renter, </w:t>
+        <w:t>As a renter</w:t>
+      </w:r>
+      <w:proofErr w:type="gramStart"/>
+      <w:r>
+        <w:rPr>
+          <w:rFonts w:asciiTheme="majorBidi" w:hAnsiTheme="majorBidi" w:cstheme="majorBidi"/>
+          <w:sz w:val="28"/>
+          <w:szCs w:val="28"/>
+        </w:rPr>
+        <w:t xml:space="preserve">, </w:t>
       </w:r>
       <w:r>
         <w:rPr>
@@ -645,7 +732,16 @@
           <w:sz w:val="28"/>
           <w:szCs w:val="28"/>
         </w:rPr>
-        <w:t xml:space="preserve">I want to search for cars </w:t>
+        <w:t>I</w:t>
+      </w:r>
+      <w:proofErr w:type="gramEnd"/>
+      <w:r>
+        <w:rPr>
+          <w:rFonts w:asciiTheme="majorBidi" w:hAnsiTheme="majorBidi" w:cstheme="majorBidi"/>
+          <w:sz w:val="28"/>
+          <w:szCs w:val="28"/>
+        </w:rPr>
+        <w:t xml:space="preserve"> want to search for cars </w:t>
       </w:r>
       <w:r>
         <w:rPr>
@@ -683,7 +779,16 @@
           <w:sz w:val="28"/>
           <w:szCs w:val="28"/>
         </w:rPr>
-        <w:t xml:space="preserve">As a renter, </w:t>
+        <w:t>As a renter</w:t>
+      </w:r>
+      <w:proofErr w:type="gramStart"/>
+      <w:r>
+        <w:rPr>
+          <w:rFonts w:asciiTheme="majorBidi" w:hAnsiTheme="majorBidi" w:cstheme="majorBidi"/>
+          <w:sz w:val="28"/>
+          <w:szCs w:val="28"/>
+        </w:rPr>
+        <w:t xml:space="preserve">, </w:t>
       </w:r>
       <w:r>
         <w:rPr>
@@ -699,7 +804,16 @@
           <w:sz w:val="28"/>
           <w:szCs w:val="28"/>
         </w:rPr>
-        <w:t xml:space="preserve">I want to book a car </w:t>
+        <w:t>I</w:t>
+      </w:r>
+      <w:proofErr w:type="gramEnd"/>
+      <w:r>
+        <w:rPr>
+          <w:rFonts w:asciiTheme="majorBidi" w:hAnsiTheme="majorBidi" w:cstheme="majorBidi"/>
+          <w:sz w:val="28"/>
+          <w:szCs w:val="28"/>
+        </w:rPr>
+        <w:t xml:space="preserve"> want to book a car </w:t>
       </w:r>
       <w:r>
         <w:rPr>
@@ -737,7 +851,16 @@
           <w:sz w:val="28"/>
           <w:szCs w:val="28"/>
         </w:rPr>
-        <w:t xml:space="preserve">As a user, </w:t>
+        <w:t>As a user</w:t>
+      </w:r>
+      <w:proofErr w:type="gramStart"/>
+      <w:r>
+        <w:rPr>
+          <w:rFonts w:asciiTheme="majorBidi" w:hAnsiTheme="majorBidi" w:cstheme="majorBidi"/>
+          <w:sz w:val="28"/>
+          <w:szCs w:val="28"/>
+        </w:rPr>
+        <w:t xml:space="preserve">, </w:t>
       </w:r>
       <w:r>
         <w:rPr>
@@ -753,7 +876,34 @@
           <w:sz w:val="28"/>
           <w:szCs w:val="28"/>
         </w:rPr>
-        <w:t xml:space="preserve">I want to see availability </w:t>
+        <w:t>I</w:t>
+      </w:r>
+      <w:proofErr w:type="gramEnd"/>
+      <w:r>
+        <w:rPr>
+          <w:rFonts w:asciiTheme="majorBidi" w:hAnsiTheme="majorBidi" w:cstheme="majorBidi"/>
+          <w:sz w:val="28"/>
+          <w:szCs w:val="28"/>
+        </w:rPr>
+        <w:t xml:space="preserve"> want to see </w:t>
+      </w:r>
+      <w:proofErr w:type="gramStart"/>
+      <w:r>
+        <w:rPr>
+          <w:rFonts w:asciiTheme="majorBidi" w:hAnsiTheme="majorBidi" w:cstheme="majorBidi"/>
+          <w:sz w:val="28"/>
+          <w:szCs w:val="28"/>
+        </w:rPr>
+        <w:t>availability</w:t>
+      </w:r>
+      <w:proofErr w:type="gramEnd"/>
+      <w:r>
+        <w:rPr>
+          <w:rFonts w:asciiTheme="majorBidi" w:hAnsiTheme="majorBidi" w:cstheme="majorBidi"/>
+          <w:sz w:val="28"/>
+          <w:szCs w:val="28"/>
+        </w:rPr>
+        <w:t xml:space="preserve"> </w:t>
       </w:r>
       <w:r>
         <w:rPr>
@@ -791,7 +941,16 @@
           <w:sz w:val="28"/>
           <w:szCs w:val="28"/>
         </w:rPr>
-        <w:t xml:space="preserve">As an admin, </w:t>
+        <w:t>As an admin</w:t>
+      </w:r>
+      <w:proofErr w:type="gramStart"/>
+      <w:r>
+        <w:rPr>
+          <w:rFonts w:asciiTheme="majorBidi" w:hAnsiTheme="majorBidi" w:cstheme="majorBidi"/>
+          <w:sz w:val="28"/>
+          <w:szCs w:val="28"/>
+        </w:rPr>
+        <w:t xml:space="preserve">, </w:t>
       </w:r>
       <w:r>
         <w:rPr>
@@ -807,7 +966,16 @@
           <w:sz w:val="28"/>
           <w:szCs w:val="28"/>
         </w:rPr>
-        <w:t>I want to manage users/listings</w:t>
+        <w:t>I</w:t>
+      </w:r>
+      <w:proofErr w:type="gramEnd"/>
+      <w:r>
+        <w:rPr>
+          <w:rFonts w:asciiTheme="majorBidi" w:hAnsiTheme="majorBidi" w:cstheme="majorBidi"/>
+          <w:sz w:val="28"/>
+          <w:szCs w:val="28"/>
+        </w:rPr>
+        <w:t xml:space="preserve"> want to manage users/listings</w:t>
       </w:r>
     </w:p>
     <w:p>
@@ -933,6 +1101,7 @@
         </w:rPr>
         <w:t xml:space="preserve">: </w:t>
       </w:r>
+      <w:proofErr w:type="gramStart"/>
       <w:r>
         <w:rPr>
           <w:rFonts w:asciiTheme="majorBidi" w:hAnsiTheme="majorBidi" w:cstheme="majorBidi"/>
@@ -957,6 +1126,7 @@
         </w:rPr>
         <w:t>caching</w:t>
       </w:r>
+      <w:proofErr w:type="gramEnd"/>
     </w:p>
     <w:p>
       <w:pPr>
@@ -987,6 +1157,7 @@
         </w:rPr>
         <w:t xml:space="preserve">: </w:t>
       </w:r>
+      <w:proofErr w:type="gramStart"/>
       <w:r>
         <w:rPr>
           <w:rFonts w:asciiTheme="majorBidi" w:hAnsiTheme="majorBidi" w:cstheme="majorBidi"/>
@@ -1009,7 +1180,16 @@
           <w:sz w:val="28"/>
           <w:szCs w:val="28"/>
         </w:rPr>
-        <w:t xml:space="preserve">retries </w:t>
+        <w:t>retries</w:t>
+      </w:r>
+      <w:proofErr w:type="gramEnd"/>
+      <w:r>
+        <w:rPr>
+          <w:rFonts w:asciiTheme="majorBidi" w:hAnsiTheme="majorBidi" w:cstheme="majorBidi"/>
+          <w:sz w:val="28"/>
+          <w:szCs w:val="28"/>
+        </w:rPr>
+        <w:t xml:space="preserve"> </w:t>
       </w:r>
       <w:r>
         <w:rPr>
@@ -1166,10 +1346,10 @@
           <w:szCs w:val="32"/>
         </w:rPr>
         <w:drawing>
-          <wp:inline distT="0" distB="0" distL="0" distR="0" wp14:anchorId="6210CF5A" wp14:editId="57ABF433">
-            <wp:extent cx="5943600" cy="3947160"/>
-            <wp:effectExtent l="0" t="0" r="0" b="0"/>
-            <wp:docPr id="2014577157" name="Picture 2"/>
+          <wp:inline distT="0" distB="0" distL="0" distR="0" wp14:anchorId="2888D4C5" wp14:editId="1BB6AC9E">
+            <wp:extent cx="5943600" cy="4965065"/>
+            <wp:effectExtent l="0" t="0" r="0" b="6985"/>
+            <wp:docPr id="683367637" name="Picture 1"/>
             <wp:cNvGraphicFramePr>
               <a:graphicFrameLocks xmlns:a="http://schemas.openxmlformats.org/drawingml/2006/main" noChangeAspect="1"/>
             </wp:cNvGraphicFramePr>
@@ -1177,7 +1357,7 @@
               <a:graphicData uri="http://schemas.openxmlformats.org/drawingml/2006/picture">
                 <pic:pic xmlns:pic="http://schemas.openxmlformats.org/drawingml/2006/picture">
                   <pic:nvPicPr>
-                    <pic:cNvPr id="2014577157" name="Picture 2014577157"/>
+                    <pic:cNvPr id="683367637" name="Picture 683367637"/>
                     <pic:cNvPicPr/>
                   </pic:nvPicPr>
                   <pic:blipFill>
@@ -1195,7 +1375,7 @@
                   <pic:spPr>
                     <a:xfrm>
                       <a:off x="0" y="0"/>
-                      <a:ext cx="5943600" cy="3947160"/>
+                      <a:ext cx="5943600" cy="4965065"/>
                     </a:xfrm>
                     <a:prstGeom prst="rect">
                       <a:avLst/>
@@ -1229,6 +1409,2112 @@
           <w:szCs w:val="32"/>
         </w:rPr>
       </w:pPr>
+    </w:p>
+    <w:p>
+      <w:pPr>
+        <w:rPr>
+          <w:rFonts w:asciiTheme="majorBidi" w:hAnsiTheme="majorBidi" w:cstheme="majorBidi"/>
+          <w:b/>
+          <w:bCs/>
+          <w:sz w:val="32"/>
+          <w:szCs w:val="32"/>
+        </w:rPr>
+      </w:pPr>
+    </w:p>
+    <w:p>
+      <w:pPr>
+        <w:rPr>
+          <w:rFonts w:asciiTheme="majorBidi" w:hAnsiTheme="majorBidi" w:cstheme="majorBidi"/>
+          <w:b/>
+          <w:bCs/>
+          <w:sz w:val="32"/>
+          <w:szCs w:val="32"/>
+        </w:rPr>
+      </w:pPr>
+      <w:r>
+        <w:rPr>
+          <w:rFonts w:asciiTheme="majorBidi" w:hAnsiTheme="majorBidi" w:cstheme="majorBidi"/>
+          <w:b/>
+          <w:bCs/>
+          <w:noProof/>
+          <w:sz w:val="32"/>
+          <w:szCs w:val="32"/>
+        </w:rPr>
+        <w:lastRenderedPageBreak/>
+        <w:drawing>
+          <wp:inline distT="0" distB="0" distL="0" distR="0" wp14:anchorId="2308DB70" wp14:editId="2329FDC5">
+            <wp:extent cx="5943600" cy="2216727"/>
+            <wp:effectExtent l="0" t="0" r="0" b="0"/>
+            <wp:docPr id="398809086" name="Picture 2"/>
+            <wp:cNvGraphicFramePr>
+              <a:graphicFrameLocks xmlns:a="http://schemas.openxmlformats.org/drawingml/2006/main" noChangeAspect="1"/>
+            </wp:cNvGraphicFramePr>
+            <a:graphic xmlns:a="http://schemas.openxmlformats.org/drawingml/2006/main">
+              <a:graphicData uri="http://schemas.openxmlformats.org/drawingml/2006/picture">
+                <pic:pic xmlns:pic="http://schemas.openxmlformats.org/drawingml/2006/picture">
+                  <pic:nvPicPr>
+                    <pic:cNvPr id="398809086" name="Picture 398809086"/>
+                    <pic:cNvPicPr/>
+                  </pic:nvPicPr>
+                  <pic:blipFill rotWithShape="1">
+                    <a:blip r:embed="rId6" cstate="print">
+                      <a:extLst>
+                        <a:ext uri="{28A0092B-C50C-407E-A947-70E740481C1C}">
+                          <a14:useLocalDpi xmlns:a14="http://schemas.microsoft.com/office/drawing/2010/main" val="0"/>
+                        </a:ext>
+                      </a:extLst>
+                    </a:blip>
+                    <a:srcRect b="13291"/>
+                    <a:stretch>
+                      <a:fillRect/>
+                    </a:stretch>
+                  </pic:blipFill>
+                  <pic:spPr bwMode="auto">
+                    <a:xfrm>
+                      <a:off x="0" y="0"/>
+                      <a:ext cx="5943600" cy="2216727"/>
+                    </a:xfrm>
+                    <a:prstGeom prst="rect">
+                      <a:avLst/>
+                    </a:prstGeom>
+                    <a:ln>
+                      <a:noFill/>
+                    </a:ln>
+                    <a:extLst>
+                      <a:ext uri="{53640926-AAD7-44D8-BBD7-CCE9431645EC}">
+                        <a14:shadowObscured xmlns:a14="http://schemas.microsoft.com/office/drawing/2010/main"/>
+                      </a:ext>
+                    </a:extLst>
+                  </pic:spPr>
+                </pic:pic>
+              </a:graphicData>
+            </a:graphic>
+          </wp:inline>
+        </w:drawing>
+      </w:r>
+    </w:p>
+    <w:p>
+      <w:pPr>
+        <w:rPr>
+          <w:rFonts w:asciiTheme="majorBidi" w:hAnsiTheme="majorBidi" w:cstheme="majorBidi"/>
+          <w:b/>
+          <w:bCs/>
+          <w:sz w:val="32"/>
+          <w:szCs w:val="32"/>
+        </w:rPr>
+      </w:pPr>
+    </w:p>
+    <w:p>
+      <w:pPr>
+        <w:rPr>
+          <w:rFonts w:asciiTheme="majorBidi" w:hAnsiTheme="majorBidi" w:cstheme="majorBidi"/>
+          <w:b/>
+          <w:bCs/>
+          <w:sz w:val="32"/>
+          <w:szCs w:val="32"/>
+        </w:rPr>
+      </w:pPr>
+    </w:p>
+    <w:p>
+      <w:pPr>
+        <w:rPr>
+          <w:rFonts w:asciiTheme="majorBidi" w:hAnsiTheme="majorBidi" w:cstheme="majorBidi"/>
+          <w:b/>
+          <w:bCs/>
+          <w:sz w:val="32"/>
+          <w:szCs w:val="32"/>
+        </w:rPr>
+      </w:pPr>
+      <w:r>
+        <w:rPr>
+          <w:rFonts w:asciiTheme="majorBidi" w:hAnsiTheme="majorBidi" w:cstheme="majorBidi"/>
+          <w:b/>
+          <w:bCs/>
+          <w:noProof/>
+          <w:sz w:val="32"/>
+          <w:szCs w:val="32"/>
+        </w:rPr>
+        <w:drawing>
+          <wp:inline distT="0" distB="0" distL="0" distR="0" wp14:anchorId="5C463AFC" wp14:editId="4DE204D1">
+            <wp:extent cx="5943600" cy="4334510"/>
+            <wp:effectExtent l="0" t="0" r="0" b="0"/>
+            <wp:docPr id="1603719092" name="Graphic 3"/>
+            <wp:cNvGraphicFramePr>
+              <a:graphicFrameLocks xmlns:a="http://schemas.openxmlformats.org/drawingml/2006/main" noChangeAspect="1"/>
+            </wp:cNvGraphicFramePr>
+            <a:graphic xmlns:a="http://schemas.openxmlformats.org/drawingml/2006/main">
+              <a:graphicData uri="http://schemas.openxmlformats.org/drawingml/2006/picture">
+                <pic:pic xmlns:pic="http://schemas.openxmlformats.org/drawingml/2006/picture">
+                  <pic:nvPicPr>
+                    <pic:cNvPr id="1189566122" name="Graphic 1189566122"/>
+                    <pic:cNvPicPr/>
+                  </pic:nvPicPr>
+                  <pic:blipFill rotWithShape="1">
+                    <a:blip r:embed="rId7">
+                      <a:extLst>
+                        <a:ext uri="{96DAC541-7B7A-43D3-8B79-37D633B846F1}">
+                          <asvg:svgBlip xmlns:asvg="http://schemas.microsoft.com/office/drawing/2016/SVG/main" r:embed="rId8"/>
+                        </a:ext>
+                      </a:extLst>
+                    </a:blip>
+                    <a:srcRect b="21506"/>
+                    <a:stretch>
+                      <a:fillRect/>
+                    </a:stretch>
+                  </pic:blipFill>
+                  <pic:spPr bwMode="auto">
+                    <a:xfrm>
+                      <a:off x="0" y="0"/>
+                      <a:ext cx="5943600" cy="4334510"/>
+                    </a:xfrm>
+                    <a:prstGeom prst="rect">
+                      <a:avLst/>
+                    </a:prstGeom>
+                    <a:ln>
+                      <a:noFill/>
+                    </a:ln>
+                    <a:extLst>
+                      <a:ext uri="{53640926-AAD7-44D8-BBD7-CCE9431645EC}">
+                        <a14:shadowObscured xmlns:a14="http://schemas.microsoft.com/office/drawing/2010/main"/>
+                      </a:ext>
+                    </a:extLst>
+                  </pic:spPr>
+                </pic:pic>
+              </a:graphicData>
+            </a:graphic>
+          </wp:inline>
+        </w:drawing>
+      </w:r>
+    </w:p>
+    <w:p/>
+    <w:p/>
+    <w:p>
+      <w:pPr>
+        <w:rPr>
+          <w:rFonts w:asciiTheme="majorBidi" w:hAnsiTheme="majorBidi" w:cstheme="majorBidi"/>
+          <w:b/>
+          <w:bCs/>
+          <w:sz w:val="32"/>
+          <w:szCs w:val="32"/>
+        </w:rPr>
+      </w:pPr>
+      <w:r>
+        <w:rPr>
+          <w:rFonts w:asciiTheme="majorBidi" w:hAnsiTheme="majorBidi" w:cstheme="majorBidi"/>
+          <w:b/>
+          <w:bCs/>
+          <w:noProof/>
+          <w:sz w:val="32"/>
+          <w:szCs w:val="32"/>
+        </w:rPr>
+        <w:lastRenderedPageBreak/>
+        <w:drawing>
+          <wp:inline distT="0" distB="0" distL="0" distR="0" wp14:anchorId="2B07BC65" wp14:editId="6912CC82">
+            <wp:extent cx="5943600" cy="4526280"/>
+            <wp:effectExtent l="0" t="0" r="0" b="7620"/>
+            <wp:docPr id="2096709482" name="Graphic 7"/>
+            <wp:cNvGraphicFramePr>
+              <a:graphicFrameLocks xmlns:a="http://schemas.openxmlformats.org/drawingml/2006/main" noChangeAspect="1"/>
+            </wp:cNvGraphicFramePr>
+            <a:graphic xmlns:a="http://schemas.openxmlformats.org/drawingml/2006/main">
+              <a:graphicData uri="http://schemas.openxmlformats.org/drawingml/2006/picture">
+                <pic:pic xmlns:pic="http://schemas.openxmlformats.org/drawingml/2006/picture">
+                  <pic:nvPicPr>
+                    <pic:cNvPr id="2096709482" name="Graphic 2096709482"/>
+                    <pic:cNvPicPr/>
+                  </pic:nvPicPr>
+                  <pic:blipFill rotWithShape="1">
+                    <a:blip r:embed="rId9">
+                      <a:extLst>
+                        <a:ext uri="{96DAC541-7B7A-43D3-8B79-37D633B846F1}">
+                          <asvg:svgBlip xmlns:asvg="http://schemas.microsoft.com/office/drawing/2016/SVG/main" r:embed="rId10"/>
+                        </a:ext>
+                      </a:extLst>
+                    </a:blip>
+                    <a:srcRect t="-1" b="21688"/>
+                    <a:stretch>
+                      <a:fillRect/>
+                    </a:stretch>
+                  </pic:blipFill>
+                  <pic:spPr bwMode="auto">
+                    <a:xfrm>
+                      <a:off x="0" y="0"/>
+                      <a:ext cx="5943600" cy="4526280"/>
+                    </a:xfrm>
+                    <a:prstGeom prst="rect">
+                      <a:avLst/>
+                    </a:prstGeom>
+                    <a:ln>
+                      <a:noFill/>
+                    </a:ln>
+                    <a:extLst>
+                      <a:ext uri="{53640926-AAD7-44D8-BBD7-CCE9431645EC}">
+                        <a14:shadowObscured xmlns:a14="http://schemas.microsoft.com/office/drawing/2010/main"/>
+                      </a:ext>
+                    </a:extLst>
+                  </pic:spPr>
+                </pic:pic>
+              </a:graphicData>
+            </a:graphic>
+          </wp:inline>
+        </w:drawing>
+      </w:r>
+      <w:r>
+        <w:rPr>
+          <w:rFonts w:asciiTheme="majorBidi" w:hAnsiTheme="majorBidi" w:cstheme="majorBidi"/>
+          <w:b/>
+          <w:bCs/>
+          <w:noProof/>
+          <w:sz w:val="32"/>
+          <w:szCs w:val="32"/>
+        </w:rPr>
+        <w:drawing>
+          <wp:inline distT="0" distB="0" distL="0" distR="0" wp14:anchorId="41A5A489" wp14:editId="184262DC">
+            <wp:extent cx="5943600" cy="3467100"/>
+            <wp:effectExtent l="0" t="0" r="0" b="0"/>
+            <wp:docPr id="149577754" name="Picture 9"/>
+            <wp:cNvGraphicFramePr>
+              <a:graphicFrameLocks xmlns:a="http://schemas.openxmlformats.org/drawingml/2006/main" noChangeAspect="1"/>
+            </wp:cNvGraphicFramePr>
+            <a:graphic xmlns:a="http://schemas.openxmlformats.org/drawingml/2006/main">
+              <a:graphicData uri="http://schemas.openxmlformats.org/drawingml/2006/picture">
+                <pic:pic xmlns:pic="http://schemas.openxmlformats.org/drawingml/2006/picture">
+                  <pic:nvPicPr>
+                    <pic:cNvPr id="149577754" name="Picture 149577754"/>
+                    <pic:cNvPicPr/>
+                  </pic:nvPicPr>
+                  <pic:blipFill rotWithShape="1">
+                    <a:blip r:embed="rId11">
+                      <a:extLst>
+                        <a:ext uri="{28A0092B-C50C-407E-A947-70E740481C1C}">
+                          <a14:useLocalDpi xmlns:a14="http://schemas.microsoft.com/office/drawing/2010/main" val="0"/>
+                        </a:ext>
+                      </a:extLst>
+                    </a:blip>
+                    <a:srcRect b="20141"/>
+                    <a:stretch>
+                      <a:fillRect/>
+                    </a:stretch>
+                  </pic:blipFill>
+                  <pic:spPr bwMode="auto">
+                    <a:xfrm>
+                      <a:off x="0" y="0"/>
+                      <a:ext cx="5943600" cy="3467100"/>
+                    </a:xfrm>
+                    <a:prstGeom prst="rect">
+                      <a:avLst/>
+                    </a:prstGeom>
+                    <a:ln>
+                      <a:noFill/>
+                    </a:ln>
+                    <a:extLst>
+                      <a:ext uri="{53640926-AAD7-44D8-BBD7-CCE9431645EC}">
+                        <a14:shadowObscured xmlns:a14="http://schemas.microsoft.com/office/drawing/2010/main"/>
+                      </a:ext>
+                    </a:extLst>
+                  </pic:spPr>
+                </pic:pic>
+              </a:graphicData>
+            </a:graphic>
+          </wp:inline>
+        </w:drawing>
+      </w:r>
+    </w:p>
+    <w:p>
+      <w:pPr>
+        <w:rPr>
+          <w:rFonts w:asciiTheme="majorBidi" w:hAnsiTheme="majorBidi" w:cstheme="majorBidi"/>
+          <w:b/>
+          <w:bCs/>
+          <w:sz w:val="32"/>
+          <w:szCs w:val="32"/>
+        </w:rPr>
+      </w:pPr>
+      <w:r>
+        <w:rPr>
+          <w:rFonts w:asciiTheme="majorBidi" w:hAnsiTheme="majorBidi" w:cstheme="majorBidi"/>
+          <w:b/>
+          <w:bCs/>
+          <w:noProof/>
+          <w:sz w:val="32"/>
+          <w:szCs w:val="32"/>
+        </w:rPr>
+        <w:lastRenderedPageBreak/>
+        <w:drawing>
+          <wp:anchor distT="0" distB="0" distL="114300" distR="114300" simplePos="0" relativeHeight="251660288" behindDoc="0" locked="0" layoutInCell="1" allowOverlap="1" wp14:anchorId="786E58F7" wp14:editId="54DF02DC">
+            <wp:simplePos x="0" y="0"/>
+            <wp:positionH relativeFrom="page">
+              <wp:posOffset>1051560</wp:posOffset>
+            </wp:positionH>
+            <wp:positionV relativeFrom="paragraph">
+              <wp:posOffset>-441960</wp:posOffset>
+            </wp:positionV>
+            <wp:extent cx="5943600" cy="4362450"/>
+            <wp:effectExtent l="0" t="0" r="0" b="0"/>
+            <wp:wrapNone/>
+            <wp:docPr id="1344326045" name="Picture 6"/>
+            <wp:cNvGraphicFramePr>
+              <a:graphicFrameLocks xmlns:a="http://schemas.openxmlformats.org/drawingml/2006/main" noChangeAspect="1"/>
+            </wp:cNvGraphicFramePr>
+            <a:graphic xmlns:a="http://schemas.openxmlformats.org/drawingml/2006/main">
+              <a:graphicData uri="http://schemas.openxmlformats.org/drawingml/2006/picture">
+                <pic:pic xmlns:pic="http://schemas.openxmlformats.org/drawingml/2006/picture">
+                  <pic:nvPicPr>
+                    <pic:cNvPr id="1344326045" name="Picture 1344326045"/>
+                    <pic:cNvPicPr/>
+                  </pic:nvPicPr>
+                  <pic:blipFill rotWithShape="1">
+                    <a:blip r:embed="rId12">
+                      <a:extLst>
+                        <a:ext uri="{28A0092B-C50C-407E-A947-70E740481C1C}">
+                          <a14:useLocalDpi xmlns:a14="http://schemas.microsoft.com/office/drawing/2010/main" val="0"/>
+                        </a:ext>
+                      </a:extLst>
+                    </a:blip>
+                    <a:srcRect b="21333"/>
+                    <a:stretch>
+                      <a:fillRect/>
+                    </a:stretch>
+                  </pic:blipFill>
+                  <pic:spPr bwMode="auto">
+                    <a:xfrm>
+                      <a:off x="0" y="0"/>
+                      <a:ext cx="5943600" cy="4362450"/>
+                    </a:xfrm>
+                    <a:prstGeom prst="rect">
+                      <a:avLst/>
+                    </a:prstGeom>
+                    <a:ln>
+                      <a:noFill/>
+                    </a:ln>
+                    <a:extLst>
+                      <a:ext uri="{53640926-AAD7-44D8-BBD7-CCE9431645EC}">
+                        <a14:shadowObscured xmlns:a14="http://schemas.microsoft.com/office/drawing/2010/main"/>
+                      </a:ext>
+                    </a:extLst>
+                  </pic:spPr>
+                </pic:pic>
+              </a:graphicData>
+            </a:graphic>
+          </wp:anchor>
+        </w:drawing>
+      </w:r>
+    </w:p>
+    <w:p>
+      <w:pPr>
+        <w:rPr>
+          <w:rFonts w:asciiTheme="majorBidi" w:hAnsiTheme="majorBidi" w:cstheme="majorBidi"/>
+          <w:b/>
+          <w:bCs/>
+          <w:sz w:val="32"/>
+          <w:szCs w:val="32"/>
+        </w:rPr>
+      </w:pPr>
+    </w:p>
+    <w:p>
+      <w:pPr>
+        <w:rPr>
+          <w:rFonts w:asciiTheme="majorBidi" w:hAnsiTheme="majorBidi" w:cstheme="majorBidi"/>
+          <w:b/>
+          <w:bCs/>
+          <w:sz w:val="32"/>
+          <w:szCs w:val="32"/>
+        </w:rPr>
+      </w:pPr>
+    </w:p>
+    <w:p>
+      <w:pPr>
+        <w:rPr>
+          <w:rFonts w:asciiTheme="majorBidi" w:hAnsiTheme="majorBidi" w:cstheme="majorBidi"/>
+          <w:b/>
+          <w:bCs/>
+          <w:sz w:val="32"/>
+          <w:szCs w:val="32"/>
+        </w:rPr>
+      </w:pPr>
+    </w:p>
+    <w:p>
+      <w:pPr>
+        <w:rPr>
+          <w:rFonts w:asciiTheme="majorBidi" w:hAnsiTheme="majorBidi" w:cstheme="majorBidi"/>
+          <w:b/>
+          <w:bCs/>
+          <w:sz w:val="32"/>
+          <w:szCs w:val="32"/>
+        </w:rPr>
+      </w:pPr>
+    </w:p>
+    <w:p>
+      <w:pPr>
+        <w:rPr>
+          <w:rFonts w:asciiTheme="majorBidi" w:hAnsiTheme="majorBidi" w:cstheme="majorBidi"/>
+          <w:b/>
+          <w:bCs/>
+          <w:sz w:val="32"/>
+          <w:szCs w:val="32"/>
+        </w:rPr>
+      </w:pPr>
+    </w:p>
+    <w:p>
+      <w:pPr>
+        <w:rPr>
+          <w:rFonts w:asciiTheme="majorBidi" w:hAnsiTheme="majorBidi" w:cstheme="majorBidi"/>
+          <w:b/>
+          <w:bCs/>
+          <w:sz w:val="32"/>
+          <w:szCs w:val="32"/>
+        </w:rPr>
+      </w:pPr>
+    </w:p>
+    <w:p>
+      <w:pPr>
+        <w:rPr>
+          <w:rFonts w:asciiTheme="majorBidi" w:hAnsiTheme="majorBidi" w:cstheme="majorBidi"/>
+          <w:b/>
+          <w:bCs/>
+          <w:sz w:val="32"/>
+          <w:szCs w:val="32"/>
+        </w:rPr>
+      </w:pPr>
+    </w:p>
+    <w:p>
+      <w:pPr>
+        <w:rPr>
+          <w:rFonts w:asciiTheme="majorBidi" w:hAnsiTheme="majorBidi" w:cstheme="majorBidi"/>
+          <w:b/>
+          <w:bCs/>
+          <w:sz w:val="32"/>
+          <w:szCs w:val="32"/>
+        </w:rPr>
+      </w:pPr>
+    </w:p>
+    <w:p>
+      <w:pPr>
+        <w:rPr>
+          <w:rFonts w:asciiTheme="majorBidi" w:hAnsiTheme="majorBidi" w:cstheme="majorBidi"/>
+          <w:b/>
+          <w:bCs/>
+          <w:sz w:val="32"/>
+          <w:szCs w:val="32"/>
+        </w:rPr>
+      </w:pPr>
+    </w:p>
+    <w:p>
+      <w:pPr>
+        <w:rPr>
+          <w:rFonts w:asciiTheme="majorBidi" w:hAnsiTheme="majorBidi" w:cstheme="majorBidi"/>
+          <w:b/>
+          <w:bCs/>
+          <w:sz w:val="32"/>
+          <w:szCs w:val="32"/>
+        </w:rPr>
+      </w:pPr>
+    </w:p>
+    <w:p>
+      <w:pPr>
+        <w:rPr>
+          <w:rFonts w:asciiTheme="majorBidi" w:hAnsiTheme="majorBidi" w:cstheme="majorBidi"/>
+          <w:b/>
+          <w:bCs/>
+          <w:sz w:val="32"/>
+          <w:szCs w:val="32"/>
+        </w:rPr>
+      </w:pPr>
+      <w:r>
+        <w:rPr>
+          <w:rFonts w:asciiTheme="majorBidi" w:hAnsiTheme="majorBidi" w:cstheme="majorBidi"/>
+          <w:b/>
+          <w:bCs/>
+          <w:noProof/>
+          <w:sz w:val="32"/>
+          <w:szCs w:val="32"/>
+        </w:rPr>
+        <w:drawing>
+          <wp:anchor distT="0" distB="0" distL="114300" distR="114300" simplePos="0" relativeHeight="251663360" behindDoc="0" locked="0" layoutInCell="1" allowOverlap="1" wp14:anchorId="2FEB7879" wp14:editId="3A21F365">
+            <wp:simplePos x="0" y="0"/>
+            <wp:positionH relativeFrom="margin">
+              <wp:align>right</wp:align>
+            </wp:positionH>
+            <wp:positionV relativeFrom="paragraph">
+              <wp:posOffset>172085</wp:posOffset>
+            </wp:positionV>
+            <wp:extent cx="5943600" cy="4438650"/>
+            <wp:effectExtent l="0" t="0" r="0" b="0"/>
+            <wp:wrapNone/>
+            <wp:docPr id="1125904093" name="Graphic 12"/>
+            <wp:cNvGraphicFramePr>
+              <a:graphicFrameLocks xmlns:a="http://schemas.openxmlformats.org/drawingml/2006/main" noChangeAspect="1"/>
+            </wp:cNvGraphicFramePr>
+            <a:graphic xmlns:a="http://schemas.openxmlformats.org/drawingml/2006/main">
+              <a:graphicData uri="http://schemas.openxmlformats.org/drawingml/2006/picture">
+                <pic:pic xmlns:pic="http://schemas.openxmlformats.org/drawingml/2006/picture">
+                  <pic:nvPicPr>
+                    <pic:cNvPr id="1125904093" name="Graphic 1125904093"/>
+                    <pic:cNvPicPr/>
+                  </pic:nvPicPr>
+                  <pic:blipFill rotWithShape="1">
+                    <a:blip r:embed="rId13">
+                      <a:extLst>
+                        <a:ext uri="{96DAC541-7B7A-43D3-8B79-37D633B846F1}">
+                          <asvg:svgBlip xmlns:asvg="http://schemas.microsoft.com/office/drawing/2016/SVG/main" r:embed="rId14"/>
+                        </a:ext>
+                      </a:extLst>
+                    </a:blip>
+                    <a:srcRect b="21663"/>
+                    <a:stretch>
+                      <a:fillRect/>
+                    </a:stretch>
+                  </pic:blipFill>
+                  <pic:spPr bwMode="auto">
+                    <a:xfrm>
+                      <a:off x="0" y="0"/>
+                      <a:ext cx="5943600" cy="4438650"/>
+                    </a:xfrm>
+                    <a:prstGeom prst="rect">
+                      <a:avLst/>
+                    </a:prstGeom>
+                    <a:ln>
+                      <a:noFill/>
+                    </a:ln>
+                    <a:extLst>
+                      <a:ext uri="{53640926-AAD7-44D8-BBD7-CCE9431645EC}">
+                        <a14:shadowObscured xmlns:a14="http://schemas.microsoft.com/office/drawing/2010/main"/>
+                      </a:ext>
+                    </a:extLst>
+                  </pic:spPr>
+                </pic:pic>
+              </a:graphicData>
+            </a:graphic>
+          </wp:anchor>
+        </w:drawing>
+      </w:r>
+    </w:p>
+    <w:p>
+      <w:pPr>
+        <w:rPr>
+          <w:rFonts w:asciiTheme="majorBidi" w:hAnsiTheme="majorBidi" w:cstheme="majorBidi"/>
+          <w:b/>
+          <w:bCs/>
+          <w:sz w:val="32"/>
+          <w:szCs w:val="32"/>
+        </w:rPr>
+      </w:pPr>
+    </w:p>
+    <w:p>
+      <w:pPr>
+        <w:rPr>
+          <w:rFonts w:asciiTheme="majorBidi" w:hAnsiTheme="majorBidi" w:cstheme="majorBidi"/>
+          <w:b/>
+          <w:bCs/>
+          <w:sz w:val="32"/>
+          <w:szCs w:val="32"/>
+        </w:rPr>
+      </w:pPr>
+    </w:p>
+    <w:p>
+      <w:pPr>
+        <w:rPr>
+          <w:rFonts w:asciiTheme="majorBidi" w:hAnsiTheme="majorBidi" w:cstheme="majorBidi"/>
+          <w:b/>
+          <w:bCs/>
+          <w:sz w:val="32"/>
+          <w:szCs w:val="32"/>
+        </w:rPr>
+      </w:pPr>
+    </w:p>
+    <w:p>
+      <w:pPr>
+        <w:rPr>
+          <w:rFonts w:asciiTheme="majorBidi" w:hAnsiTheme="majorBidi" w:cstheme="majorBidi"/>
+          <w:b/>
+          <w:bCs/>
+          <w:sz w:val="32"/>
+          <w:szCs w:val="32"/>
+        </w:rPr>
+      </w:pPr>
+    </w:p>
+    <w:p>
+      <w:pPr>
+        <w:rPr>
+          <w:rFonts w:asciiTheme="majorBidi" w:hAnsiTheme="majorBidi" w:cstheme="majorBidi"/>
+          <w:b/>
+          <w:bCs/>
+          <w:sz w:val="32"/>
+          <w:szCs w:val="32"/>
+        </w:rPr>
+      </w:pPr>
+    </w:p>
+    <w:p>
+      <w:pPr>
+        <w:rPr>
+          <w:rFonts w:asciiTheme="majorBidi" w:hAnsiTheme="majorBidi" w:cstheme="majorBidi"/>
+          <w:b/>
+          <w:bCs/>
+          <w:sz w:val="32"/>
+          <w:szCs w:val="32"/>
+        </w:rPr>
+      </w:pPr>
+    </w:p>
+    <w:p>
+      <w:pPr>
+        <w:rPr>
+          <w:rFonts w:asciiTheme="majorBidi" w:hAnsiTheme="majorBidi" w:cstheme="majorBidi"/>
+          <w:b/>
+          <w:bCs/>
+          <w:sz w:val="32"/>
+          <w:szCs w:val="32"/>
+        </w:rPr>
+      </w:pPr>
+    </w:p>
+    <w:p>
+      <w:pPr>
+        <w:rPr>
+          <w:rFonts w:asciiTheme="majorBidi" w:hAnsiTheme="majorBidi" w:cstheme="majorBidi"/>
+          <w:b/>
+          <w:bCs/>
+          <w:sz w:val="32"/>
+          <w:szCs w:val="32"/>
+        </w:rPr>
+      </w:pPr>
+    </w:p>
+    <w:p>
+      <w:pPr>
+        <w:rPr>
+          <w:rFonts w:asciiTheme="majorBidi" w:hAnsiTheme="majorBidi" w:cstheme="majorBidi"/>
+          <w:b/>
+          <w:bCs/>
+          <w:sz w:val="32"/>
+          <w:szCs w:val="32"/>
+        </w:rPr>
+      </w:pPr>
+    </w:p>
+    <w:p>
+      <w:pPr>
+        <w:rPr>
+          <w:rFonts w:asciiTheme="majorBidi" w:hAnsiTheme="majorBidi" w:cstheme="majorBidi"/>
+          <w:b/>
+          <w:bCs/>
+          <w:sz w:val="32"/>
+          <w:szCs w:val="32"/>
+        </w:rPr>
+      </w:pPr>
+    </w:p>
+    <w:p>
+      <w:pPr>
+        <w:rPr>
+          <w:rFonts w:asciiTheme="majorBidi" w:hAnsiTheme="majorBidi" w:cstheme="majorBidi"/>
+          <w:b/>
+          <w:bCs/>
+          <w:sz w:val="32"/>
+          <w:szCs w:val="32"/>
+        </w:rPr>
+      </w:pPr>
+      <w:r>
+        <w:rPr>
+          <w:rFonts w:asciiTheme="majorBidi" w:hAnsiTheme="majorBidi" w:cstheme="majorBidi"/>
+          <w:b/>
+          <w:bCs/>
+          <w:noProof/>
+          <w:sz w:val="32"/>
+          <w:szCs w:val="32"/>
+        </w:rPr>
+        <w:lastRenderedPageBreak/>
+        <w:drawing>
+          <wp:anchor distT="0" distB="0" distL="114300" distR="114300" simplePos="0" relativeHeight="251664384" behindDoc="0" locked="0" layoutInCell="1" allowOverlap="1" wp14:anchorId="43E409C5" wp14:editId="6C4779EC">
+            <wp:simplePos x="0" y="0"/>
+            <wp:positionH relativeFrom="column">
+              <wp:posOffset>15240</wp:posOffset>
+            </wp:positionH>
+            <wp:positionV relativeFrom="paragraph">
+              <wp:posOffset>-411480</wp:posOffset>
+            </wp:positionV>
+            <wp:extent cx="5943600" cy="5486400"/>
+            <wp:effectExtent l="0" t="0" r="0" b="0"/>
+            <wp:wrapNone/>
+            <wp:docPr id="1864617422" name="Graphic 11"/>
+            <wp:cNvGraphicFramePr>
+              <a:graphicFrameLocks xmlns:a="http://schemas.openxmlformats.org/drawingml/2006/main" noChangeAspect="1"/>
+            </wp:cNvGraphicFramePr>
+            <a:graphic xmlns:a="http://schemas.openxmlformats.org/drawingml/2006/main">
+              <a:graphicData uri="http://schemas.openxmlformats.org/drawingml/2006/picture">
+                <pic:pic xmlns:pic="http://schemas.openxmlformats.org/drawingml/2006/picture">
+                  <pic:nvPicPr>
+                    <pic:cNvPr id="1864617422" name="Graphic 1864617422"/>
+                    <pic:cNvPicPr/>
+                  </pic:nvPicPr>
+                  <pic:blipFill rotWithShape="1">
+                    <a:blip r:embed="rId15">
+                      <a:extLst>
+                        <a:ext uri="{96DAC541-7B7A-43D3-8B79-37D633B846F1}">
+                          <asvg:svgBlip xmlns:asvg="http://schemas.microsoft.com/office/drawing/2016/SVG/main" r:embed="rId16"/>
+                        </a:ext>
+                      </a:extLst>
+                    </a:blip>
+                    <a:srcRect b="22295"/>
+                    <a:stretch>
+                      <a:fillRect/>
+                    </a:stretch>
+                  </pic:blipFill>
+                  <pic:spPr bwMode="auto">
+                    <a:xfrm>
+                      <a:off x="0" y="0"/>
+                      <a:ext cx="5943600" cy="5486400"/>
+                    </a:xfrm>
+                    <a:prstGeom prst="rect">
+                      <a:avLst/>
+                    </a:prstGeom>
+                    <a:ln>
+                      <a:noFill/>
+                    </a:ln>
+                    <a:extLst>
+                      <a:ext uri="{53640926-AAD7-44D8-BBD7-CCE9431645EC}">
+                        <a14:shadowObscured xmlns:a14="http://schemas.microsoft.com/office/drawing/2010/main"/>
+                      </a:ext>
+                    </a:extLst>
+                  </pic:spPr>
+                </pic:pic>
+              </a:graphicData>
+            </a:graphic>
+          </wp:anchor>
+        </w:drawing>
+      </w:r>
+    </w:p>
+    <w:p>
+      <w:pPr>
+        <w:rPr>
+          <w:rFonts w:asciiTheme="majorBidi" w:hAnsiTheme="majorBidi" w:cstheme="majorBidi"/>
+          <w:b/>
+          <w:bCs/>
+          <w:sz w:val="32"/>
+          <w:szCs w:val="32"/>
+        </w:rPr>
+      </w:pPr>
+    </w:p>
+    <w:p>
+      <w:pPr>
+        <w:rPr>
+          <w:rFonts w:asciiTheme="majorBidi" w:hAnsiTheme="majorBidi" w:cstheme="majorBidi"/>
+          <w:b/>
+          <w:bCs/>
+          <w:sz w:val="32"/>
+          <w:szCs w:val="32"/>
+        </w:rPr>
+      </w:pPr>
+    </w:p>
+    <w:p>
+      <w:pPr>
+        <w:rPr>
+          <w:rFonts w:asciiTheme="majorBidi" w:hAnsiTheme="majorBidi" w:cstheme="majorBidi"/>
+          <w:b/>
+          <w:bCs/>
+          <w:sz w:val="32"/>
+          <w:szCs w:val="32"/>
+        </w:rPr>
+      </w:pPr>
+    </w:p>
+    <w:p>
+      <w:pPr>
+        <w:rPr>
+          <w:rFonts w:asciiTheme="majorBidi" w:hAnsiTheme="majorBidi" w:cstheme="majorBidi"/>
+          <w:b/>
+          <w:bCs/>
+          <w:sz w:val="32"/>
+          <w:szCs w:val="32"/>
+        </w:rPr>
+      </w:pPr>
+    </w:p>
+    <w:p>
+      <w:pPr>
+        <w:rPr>
+          <w:rFonts w:asciiTheme="majorBidi" w:hAnsiTheme="majorBidi" w:cstheme="majorBidi"/>
+          <w:b/>
+          <w:bCs/>
+          <w:sz w:val="32"/>
+          <w:szCs w:val="32"/>
+        </w:rPr>
+      </w:pPr>
+    </w:p>
+    <w:p>
+      <w:pPr>
+        <w:rPr>
+          <w:rFonts w:asciiTheme="majorBidi" w:hAnsiTheme="majorBidi" w:cstheme="majorBidi"/>
+          <w:b/>
+          <w:bCs/>
+          <w:sz w:val="32"/>
+          <w:szCs w:val="32"/>
+        </w:rPr>
+      </w:pPr>
+    </w:p>
+    <w:p>
+      <w:pPr>
+        <w:rPr>
+          <w:rFonts w:asciiTheme="majorBidi" w:hAnsiTheme="majorBidi" w:cstheme="majorBidi"/>
+          <w:b/>
+          <w:bCs/>
+          <w:sz w:val="32"/>
+          <w:szCs w:val="32"/>
+        </w:rPr>
+      </w:pPr>
+    </w:p>
+    <w:p>
+      <w:pPr>
+        <w:rPr>
+          <w:rFonts w:asciiTheme="majorBidi" w:hAnsiTheme="majorBidi" w:cstheme="majorBidi"/>
+          <w:b/>
+          <w:bCs/>
+          <w:sz w:val="32"/>
+          <w:szCs w:val="32"/>
+        </w:rPr>
+      </w:pPr>
+    </w:p>
+    <w:p>
+      <w:pPr>
+        <w:rPr>
+          <w:rFonts w:asciiTheme="majorBidi" w:hAnsiTheme="majorBidi" w:cstheme="majorBidi"/>
+          <w:b/>
+          <w:bCs/>
+          <w:sz w:val="32"/>
+          <w:szCs w:val="32"/>
+        </w:rPr>
+      </w:pPr>
+    </w:p>
+    <w:p>
+      <w:pPr>
+        <w:rPr>
+          <w:rFonts w:asciiTheme="majorBidi" w:hAnsiTheme="majorBidi" w:cstheme="majorBidi"/>
+          <w:b/>
+          <w:bCs/>
+          <w:sz w:val="32"/>
+          <w:szCs w:val="32"/>
+        </w:rPr>
+      </w:pPr>
+    </w:p>
+    <w:p>
+      <w:pPr>
+        <w:rPr>
+          <w:rFonts w:asciiTheme="majorBidi" w:hAnsiTheme="majorBidi" w:cstheme="majorBidi"/>
+          <w:b/>
+          <w:bCs/>
+          <w:sz w:val="32"/>
+          <w:szCs w:val="32"/>
+        </w:rPr>
+      </w:pPr>
+    </w:p>
+    <w:p>
+      <w:pPr>
+        <w:rPr>
+          <w:rFonts w:asciiTheme="majorBidi" w:hAnsiTheme="majorBidi" w:cstheme="majorBidi"/>
+          <w:b/>
+          <w:bCs/>
+          <w:sz w:val="32"/>
+          <w:szCs w:val="32"/>
+        </w:rPr>
+      </w:pPr>
+    </w:p>
+    <w:p>
+      <w:pPr>
+        <w:rPr>
+          <w:rFonts w:asciiTheme="majorBidi" w:hAnsiTheme="majorBidi" w:cstheme="majorBidi"/>
+          <w:b/>
+          <w:bCs/>
+          <w:sz w:val="32"/>
+          <w:szCs w:val="32"/>
+        </w:rPr>
+      </w:pPr>
+    </w:p>
+    <w:p>
+      <w:pPr>
+        <w:rPr>
+          <w:rFonts w:asciiTheme="majorBidi" w:hAnsiTheme="majorBidi" w:cstheme="majorBidi"/>
+          <w:b/>
+          <w:bCs/>
+          <w:sz w:val="32"/>
+          <w:szCs w:val="32"/>
+        </w:rPr>
+      </w:pPr>
+      <w:r>
+        <w:rPr>
+          <w:rFonts w:asciiTheme="majorBidi" w:hAnsiTheme="majorBidi" w:cstheme="majorBidi"/>
+          <w:b/>
+          <w:bCs/>
+          <w:noProof/>
+          <w:sz w:val="32"/>
+          <w:szCs w:val="32"/>
+        </w:rPr>
+        <w:drawing>
+          <wp:anchor distT="0" distB="0" distL="114300" distR="114300" simplePos="0" relativeHeight="251662336" behindDoc="0" locked="0" layoutInCell="1" allowOverlap="1" wp14:anchorId="5EBEBA4A" wp14:editId="582F1C39">
+            <wp:simplePos x="0" y="0"/>
+            <wp:positionH relativeFrom="margin">
+              <wp:posOffset>-167640</wp:posOffset>
+            </wp:positionH>
+            <wp:positionV relativeFrom="paragraph">
+              <wp:posOffset>198755</wp:posOffset>
+            </wp:positionV>
+            <wp:extent cx="5943600" cy="3467100"/>
+            <wp:effectExtent l="0" t="0" r="0" b="0"/>
+            <wp:wrapNone/>
+            <wp:docPr id="1551770893" name="Graphic 10"/>
+            <wp:cNvGraphicFramePr>
+              <a:graphicFrameLocks xmlns:a="http://schemas.openxmlformats.org/drawingml/2006/main" noChangeAspect="1"/>
+            </wp:cNvGraphicFramePr>
+            <a:graphic xmlns:a="http://schemas.openxmlformats.org/drawingml/2006/main">
+              <a:graphicData uri="http://schemas.openxmlformats.org/drawingml/2006/picture">
+                <pic:pic xmlns:pic="http://schemas.openxmlformats.org/drawingml/2006/picture">
+                  <pic:nvPicPr>
+                    <pic:cNvPr id="1551770893" name="Graphic 1551770893"/>
+                    <pic:cNvPicPr/>
+                  </pic:nvPicPr>
+                  <pic:blipFill rotWithShape="1">
+                    <a:blip r:embed="rId17">
+                      <a:extLst>
+                        <a:ext uri="{96DAC541-7B7A-43D3-8B79-37D633B846F1}">
+                          <asvg:svgBlip xmlns:asvg="http://schemas.microsoft.com/office/drawing/2016/SVG/main" r:embed="rId18"/>
+                        </a:ext>
+                      </a:extLst>
+                    </a:blip>
+                    <a:srcRect b="20163"/>
+                    <a:stretch>
+                      <a:fillRect/>
+                    </a:stretch>
+                  </pic:blipFill>
+                  <pic:spPr bwMode="auto">
+                    <a:xfrm>
+                      <a:off x="0" y="0"/>
+                      <a:ext cx="5943600" cy="3467100"/>
+                    </a:xfrm>
+                    <a:prstGeom prst="rect">
+                      <a:avLst/>
+                    </a:prstGeom>
+                    <a:ln>
+                      <a:noFill/>
+                    </a:ln>
+                    <a:extLst>
+                      <a:ext uri="{53640926-AAD7-44D8-BBD7-CCE9431645EC}">
+                        <a14:shadowObscured xmlns:a14="http://schemas.microsoft.com/office/drawing/2010/main"/>
+                      </a:ext>
+                    </a:extLst>
+                  </pic:spPr>
+                </pic:pic>
+              </a:graphicData>
+            </a:graphic>
+          </wp:anchor>
+        </w:drawing>
+      </w:r>
+    </w:p>
+    <w:p>
+      <w:pPr>
+        <w:rPr>
+          <w:rFonts w:asciiTheme="majorBidi" w:hAnsiTheme="majorBidi" w:cstheme="majorBidi"/>
+          <w:b/>
+          <w:bCs/>
+          <w:sz w:val="32"/>
+          <w:szCs w:val="32"/>
+        </w:rPr>
+      </w:pPr>
+    </w:p>
+    <w:p>
+      <w:pPr>
+        <w:rPr>
+          <w:rFonts w:asciiTheme="majorBidi" w:hAnsiTheme="majorBidi" w:cstheme="majorBidi"/>
+          <w:b/>
+          <w:bCs/>
+          <w:sz w:val="32"/>
+          <w:szCs w:val="32"/>
+        </w:rPr>
+      </w:pPr>
+    </w:p>
+    <w:p>
+      <w:pPr>
+        <w:rPr>
+          <w:rFonts w:asciiTheme="majorBidi" w:hAnsiTheme="majorBidi" w:cstheme="majorBidi"/>
+          <w:b/>
+          <w:bCs/>
+          <w:sz w:val="32"/>
+          <w:szCs w:val="32"/>
+        </w:rPr>
+      </w:pPr>
+    </w:p>
+    <w:p>
+      <w:pPr>
+        <w:rPr>
+          <w:rFonts w:asciiTheme="majorBidi" w:hAnsiTheme="majorBidi" w:cstheme="majorBidi"/>
+          <w:b/>
+          <w:bCs/>
+          <w:sz w:val="32"/>
+          <w:szCs w:val="32"/>
+        </w:rPr>
+      </w:pPr>
+    </w:p>
+    <w:p>
+      <w:pPr>
+        <w:rPr>
+          <w:rFonts w:asciiTheme="majorBidi" w:hAnsiTheme="majorBidi" w:cstheme="majorBidi"/>
+          <w:b/>
+          <w:bCs/>
+          <w:sz w:val="32"/>
+          <w:szCs w:val="32"/>
+        </w:rPr>
+      </w:pPr>
+    </w:p>
+    <w:p>
+      <w:pPr>
+        <w:rPr>
+          <w:rFonts w:asciiTheme="majorBidi" w:hAnsiTheme="majorBidi" w:cstheme="majorBidi"/>
+          <w:b/>
+          <w:bCs/>
+          <w:sz w:val="32"/>
+          <w:szCs w:val="32"/>
+        </w:rPr>
+      </w:pPr>
+    </w:p>
+    <w:p>
+      <w:pPr>
+        <w:rPr>
+          <w:rFonts w:asciiTheme="majorBidi" w:hAnsiTheme="majorBidi" w:cstheme="majorBidi"/>
+          <w:b/>
+          <w:bCs/>
+          <w:sz w:val="32"/>
+          <w:szCs w:val="32"/>
+        </w:rPr>
+      </w:pPr>
+    </w:p>
+    <w:p>
+      <w:pPr>
+        <w:rPr>
+          <w:rFonts w:asciiTheme="majorBidi" w:hAnsiTheme="majorBidi" w:cstheme="majorBidi"/>
+          <w:b/>
+          <w:bCs/>
+          <w:sz w:val="32"/>
+          <w:szCs w:val="32"/>
+        </w:rPr>
+      </w:pPr>
+      <w:r>
+        <w:rPr>
+          <w:rFonts w:asciiTheme="majorBidi" w:hAnsiTheme="majorBidi" w:cstheme="majorBidi"/>
+          <w:b/>
+          <w:bCs/>
+          <w:noProof/>
+          <w:sz w:val="32"/>
+          <w:szCs w:val="32"/>
+        </w:rPr>
+        <w:lastRenderedPageBreak/>
+        <w:drawing>
+          <wp:anchor distT="0" distB="0" distL="114300" distR="114300" simplePos="0" relativeHeight="251658240" behindDoc="0" locked="0" layoutInCell="1" allowOverlap="1" wp14:anchorId="094E3157" wp14:editId="45EB7E4C">
+            <wp:simplePos x="0" y="0"/>
+            <wp:positionH relativeFrom="margin">
+              <wp:align>right</wp:align>
+            </wp:positionH>
+            <wp:positionV relativeFrom="paragraph">
+              <wp:posOffset>15240</wp:posOffset>
+            </wp:positionV>
+            <wp:extent cx="5943600" cy="6305550"/>
+            <wp:effectExtent l="0" t="0" r="0" b="0"/>
+            <wp:wrapNone/>
+            <wp:docPr id="1301616075" name="Picture 5"/>
+            <wp:cNvGraphicFramePr>
+              <a:graphicFrameLocks xmlns:a="http://schemas.openxmlformats.org/drawingml/2006/main" noChangeAspect="1"/>
+            </wp:cNvGraphicFramePr>
+            <a:graphic xmlns:a="http://schemas.openxmlformats.org/drawingml/2006/main">
+              <a:graphicData uri="http://schemas.openxmlformats.org/drawingml/2006/picture">
+                <pic:pic xmlns:pic="http://schemas.openxmlformats.org/drawingml/2006/picture">
+                  <pic:nvPicPr>
+                    <pic:cNvPr id="1301616075" name="Picture 1301616075"/>
+                    <pic:cNvPicPr/>
+                  </pic:nvPicPr>
+                  <pic:blipFill rotWithShape="1">
+                    <a:blip r:embed="rId19">
+                      <a:extLst>
+                        <a:ext uri="{28A0092B-C50C-407E-A947-70E740481C1C}">
+                          <a14:useLocalDpi xmlns:a14="http://schemas.microsoft.com/office/drawing/2010/main" val="0"/>
+                        </a:ext>
+                      </a:extLst>
+                    </a:blip>
+                    <a:srcRect b="20343"/>
+                    <a:stretch>
+                      <a:fillRect/>
+                    </a:stretch>
+                  </pic:blipFill>
+                  <pic:spPr bwMode="auto">
+                    <a:xfrm>
+                      <a:off x="0" y="0"/>
+                      <a:ext cx="5943600" cy="6305550"/>
+                    </a:xfrm>
+                    <a:prstGeom prst="rect">
+                      <a:avLst/>
+                    </a:prstGeom>
+                    <a:ln>
+                      <a:noFill/>
+                    </a:ln>
+                    <a:extLst>
+                      <a:ext uri="{53640926-AAD7-44D8-BBD7-CCE9431645EC}">
+                        <a14:shadowObscured xmlns:a14="http://schemas.microsoft.com/office/drawing/2010/main"/>
+                      </a:ext>
+                    </a:extLst>
+                  </pic:spPr>
+                </pic:pic>
+              </a:graphicData>
+            </a:graphic>
+          </wp:anchor>
+        </w:drawing>
+      </w:r>
+    </w:p>
+    <w:p>
+      <w:pPr>
+        <w:rPr>
+          <w:rFonts w:asciiTheme="majorBidi" w:hAnsiTheme="majorBidi" w:cstheme="majorBidi"/>
+          <w:b/>
+          <w:bCs/>
+          <w:sz w:val="32"/>
+          <w:szCs w:val="32"/>
+        </w:rPr>
+      </w:pPr>
+    </w:p>
+    <w:p>
+      <w:pPr>
+        <w:rPr>
+          <w:rFonts w:asciiTheme="majorBidi" w:hAnsiTheme="majorBidi" w:cstheme="majorBidi"/>
+          <w:b/>
+          <w:bCs/>
+          <w:sz w:val="32"/>
+          <w:szCs w:val="32"/>
+        </w:rPr>
+      </w:pPr>
+    </w:p>
+    <w:p>
+      <w:pPr>
+        <w:rPr>
+          <w:rFonts w:asciiTheme="majorBidi" w:hAnsiTheme="majorBidi" w:cstheme="majorBidi"/>
+          <w:b/>
+          <w:bCs/>
+          <w:sz w:val="32"/>
+          <w:szCs w:val="32"/>
+        </w:rPr>
+      </w:pPr>
+    </w:p>
+    <w:p>
+      <w:pPr>
+        <w:rPr>
+          <w:rFonts w:asciiTheme="majorBidi" w:hAnsiTheme="majorBidi" w:cstheme="majorBidi"/>
+          <w:b/>
+          <w:bCs/>
+          <w:sz w:val="32"/>
+          <w:szCs w:val="32"/>
+        </w:rPr>
+      </w:pPr>
+    </w:p>
+    <w:p>
+      <w:pPr>
+        <w:rPr>
+          <w:rFonts w:asciiTheme="majorBidi" w:hAnsiTheme="majorBidi" w:cstheme="majorBidi"/>
+          <w:b/>
+          <w:bCs/>
+          <w:sz w:val="32"/>
+          <w:szCs w:val="32"/>
+        </w:rPr>
+      </w:pPr>
+    </w:p>
+    <w:p>
+      <w:pPr>
+        <w:rPr>
+          <w:rFonts w:asciiTheme="majorBidi" w:hAnsiTheme="majorBidi" w:cstheme="majorBidi"/>
+          <w:b/>
+          <w:bCs/>
+          <w:sz w:val="32"/>
+          <w:szCs w:val="32"/>
+        </w:rPr>
+      </w:pPr>
+    </w:p>
+    <w:p>
+      <w:pPr>
+        <w:rPr>
+          <w:rFonts w:asciiTheme="majorBidi" w:hAnsiTheme="majorBidi" w:cstheme="majorBidi"/>
+          <w:b/>
+          <w:bCs/>
+          <w:sz w:val="32"/>
+          <w:szCs w:val="32"/>
+        </w:rPr>
+      </w:pPr>
+    </w:p>
+    <w:p>
+      <w:pPr>
+        <w:rPr>
+          <w:rFonts w:asciiTheme="majorBidi" w:hAnsiTheme="majorBidi" w:cstheme="majorBidi"/>
+          <w:b/>
+          <w:bCs/>
+          <w:sz w:val="32"/>
+          <w:szCs w:val="32"/>
+        </w:rPr>
+      </w:pPr>
+    </w:p>
+    <w:p>
+      <w:pPr>
+        <w:rPr>
+          <w:rFonts w:asciiTheme="majorBidi" w:hAnsiTheme="majorBidi" w:cstheme="majorBidi"/>
+          <w:b/>
+          <w:bCs/>
+          <w:sz w:val="32"/>
+          <w:szCs w:val="32"/>
+        </w:rPr>
+      </w:pPr>
+    </w:p>
+    <w:p>
+      <w:pPr>
+        <w:rPr>
+          <w:rFonts w:asciiTheme="majorBidi" w:hAnsiTheme="majorBidi" w:cstheme="majorBidi"/>
+          <w:b/>
+          <w:bCs/>
+          <w:sz w:val="32"/>
+          <w:szCs w:val="32"/>
+        </w:rPr>
+      </w:pPr>
+    </w:p>
+    <w:p>
+      <w:pPr>
+        <w:rPr>
+          <w:rFonts w:asciiTheme="majorBidi" w:hAnsiTheme="majorBidi" w:cstheme="majorBidi"/>
+          <w:b/>
+          <w:bCs/>
+          <w:sz w:val="32"/>
+          <w:szCs w:val="32"/>
+        </w:rPr>
+      </w:pPr>
+    </w:p>
+    <w:p>
+      <w:pPr>
+        <w:rPr>
+          <w:rFonts w:asciiTheme="majorBidi" w:hAnsiTheme="majorBidi" w:cstheme="majorBidi"/>
+          <w:b/>
+          <w:bCs/>
+          <w:sz w:val="32"/>
+          <w:szCs w:val="32"/>
+        </w:rPr>
+      </w:pPr>
+    </w:p>
+    <w:p>
+      <w:pPr>
+        <w:rPr>
+          <w:rFonts w:asciiTheme="majorBidi" w:hAnsiTheme="majorBidi" w:cstheme="majorBidi"/>
+          <w:b/>
+          <w:bCs/>
+          <w:sz w:val="32"/>
+          <w:szCs w:val="32"/>
+        </w:rPr>
+      </w:pPr>
+    </w:p>
+    <w:p>
+      <w:pPr>
+        <w:rPr>
+          <w:rFonts w:asciiTheme="majorBidi" w:hAnsiTheme="majorBidi" w:cstheme="majorBidi"/>
+          <w:b/>
+          <w:bCs/>
+          <w:sz w:val="32"/>
+          <w:szCs w:val="32"/>
+        </w:rPr>
+      </w:pPr>
+    </w:p>
+    <w:p>
+      <w:pPr>
+        <w:rPr>
+          <w:rFonts w:asciiTheme="majorBidi" w:hAnsiTheme="majorBidi" w:cstheme="majorBidi"/>
+          <w:b/>
+          <w:bCs/>
+          <w:sz w:val="32"/>
+          <w:szCs w:val="32"/>
+        </w:rPr>
+      </w:pPr>
+    </w:p>
+    <w:p>
+      <w:pPr>
+        <w:rPr>
+          <w:rFonts w:asciiTheme="majorBidi" w:hAnsiTheme="majorBidi" w:cstheme="majorBidi"/>
+          <w:b/>
+          <w:bCs/>
+          <w:sz w:val="32"/>
+          <w:szCs w:val="32"/>
+        </w:rPr>
+      </w:pPr>
+    </w:p>
+    <w:p>
+      <w:pPr>
+        <w:rPr>
+          <w:rFonts w:asciiTheme="majorBidi" w:hAnsiTheme="majorBidi" w:cstheme="majorBidi"/>
+          <w:b/>
+          <w:bCs/>
+          <w:sz w:val="32"/>
+          <w:szCs w:val="32"/>
+        </w:rPr>
+      </w:pPr>
+    </w:p>
+    <w:p>
+      <w:pPr>
+        <w:rPr>
+          <w:rFonts w:asciiTheme="majorBidi" w:hAnsiTheme="majorBidi" w:cstheme="majorBidi"/>
+          <w:b/>
+          <w:bCs/>
+          <w:sz w:val="32"/>
+          <w:szCs w:val="32"/>
+        </w:rPr>
+      </w:pPr>
+    </w:p>
+    <w:p>
+      <w:pPr>
+        <w:rPr>
+          <w:rFonts w:asciiTheme="majorBidi" w:hAnsiTheme="majorBidi" w:cstheme="majorBidi"/>
+          <w:b/>
+          <w:bCs/>
+          <w:sz w:val="32"/>
+          <w:szCs w:val="32"/>
+        </w:rPr>
+      </w:pPr>
+    </w:p>
+    <w:p>
+      <w:pPr>
+        <w:rPr>
+          <w:rFonts w:asciiTheme="majorBidi" w:hAnsiTheme="majorBidi" w:cstheme="majorBidi"/>
+          <w:b/>
+          <w:bCs/>
+          <w:sz w:val="32"/>
+          <w:szCs w:val="32"/>
+        </w:rPr>
+      </w:pPr>
+    </w:p>
+    <w:p>
+      <w:pPr>
+        <w:rPr>
+          <w:rFonts w:asciiTheme="majorBidi" w:hAnsiTheme="majorBidi" w:cstheme="majorBidi"/>
+          <w:b/>
+          <w:bCs/>
+          <w:sz w:val="32"/>
+          <w:szCs w:val="32"/>
+        </w:rPr>
+      </w:pPr>
+    </w:p>
+    <w:p>
+      <w:pPr>
+        <w:rPr>
+          <w:rFonts w:asciiTheme="majorBidi" w:hAnsiTheme="majorBidi" w:cstheme="majorBidi"/>
+          <w:b/>
+          <w:bCs/>
+          <w:sz w:val="32"/>
+          <w:szCs w:val="32"/>
+        </w:rPr>
+      </w:pPr>
+    </w:p>
+    <w:p>
+      <w:pPr>
+        <w:rPr>
+          <w:rFonts w:asciiTheme="majorBidi" w:hAnsiTheme="majorBidi" w:cstheme="majorBidi"/>
+          <w:b/>
+          <w:bCs/>
+          <w:sz w:val="32"/>
+          <w:szCs w:val="32"/>
+        </w:rPr>
+      </w:pPr>
+    </w:p>
+    <w:p>
+      <w:pPr>
+        <w:rPr>
+          <w:rFonts w:asciiTheme="majorBidi" w:hAnsiTheme="majorBidi" w:cstheme="majorBidi"/>
+          <w:b/>
+          <w:bCs/>
+          <w:sz w:val="32"/>
+          <w:szCs w:val="32"/>
+        </w:rPr>
+      </w:pPr>
+      <w:r>
+        <w:rPr>
+          <w:rFonts w:asciiTheme="majorBidi" w:hAnsiTheme="majorBidi" w:cstheme="majorBidi"/>
+          <w:b/>
+          <w:bCs/>
+          <w:noProof/>
+          <w:sz w:val="32"/>
+          <w:szCs w:val="32"/>
+        </w:rPr>
+        <w:drawing>
+          <wp:anchor distT="0" distB="0" distL="114300" distR="114300" simplePos="0" relativeHeight="251661312" behindDoc="0" locked="0" layoutInCell="1" allowOverlap="1" wp14:anchorId="16C5189D" wp14:editId="2316D833">
+            <wp:simplePos x="0" y="0"/>
+            <wp:positionH relativeFrom="margin">
+              <wp:align>right</wp:align>
+            </wp:positionH>
+            <wp:positionV relativeFrom="paragraph">
+              <wp:posOffset>17780</wp:posOffset>
+            </wp:positionV>
+            <wp:extent cx="5943600" cy="3634740"/>
+            <wp:effectExtent l="0" t="0" r="0" b="3810"/>
+            <wp:wrapNone/>
+            <wp:docPr id="1550414792" name="Graphic 8"/>
+            <wp:cNvGraphicFramePr>
+              <a:graphicFrameLocks xmlns:a="http://schemas.openxmlformats.org/drawingml/2006/main" noChangeAspect="1"/>
+            </wp:cNvGraphicFramePr>
+            <a:graphic xmlns:a="http://schemas.openxmlformats.org/drawingml/2006/main">
+              <a:graphicData uri="http://schemas.openxmlformats.org/drawingml/2006/picture">
+                <pic:pic xmlns:pic="http://schemas.openxmlformats.org/drawingml/2006/picture">
+                  <pic:nvPicPr>
+                    <pic:cNvPr id="1550414792" name="Graphic 1550414792"/>
+                    <pic:cNvPicPr/>
+                  </pic:nvPicPr>
+                  <pic:blipFill rotWithShape="1">
+                    <a:blip r:embed="rId20">
+                      <a:extLst>
+                        <a:ext uri="{96DAC541-7B7A-43D3-8B79-37D633B846F1}">
+                          <asvg:svgBlip xmlns:asvg="http://schemas.microsoft.com/office/drawing/2016/SVG/main" r:embed="rId21"/>
+                        </a:ext>
+                      </a:extLst>
+                    </a:blip>
+                    <a:srcRect b="21135"/>
+                    <a:stretch>
+                      <a:fillRect/>
+                    </a:stretch>
+                  </pic:blipFill>
+                  <pic:spPr bwMode="auto">
+                    <a:xfrm>
+                      <a:off x="0" y="0"/>
+                      <a:ext cx="5943600" cy="3634740"/>
+                    </a:xfrm>
+                    <a:prstGeom prst="rect">
+                      <a:avLst/>
+                    </a:prstGeom>
+                    <a:ln>
+                      <a:noFill/>
+                    </a:ln>
+                    <a:extLst>
+                      <a:ext uri="{53640926-AAD7-44D8-BBD7-CCE9431645EC}">
+                        <a14:shadowObscured xmlns:a14="http://schemas.microsoft.com/office/drawing/2010/main"/>
+                      </a:ext>
+                    </a:extLst>
+                  </pic:spPr>
+                </pic:pic>
+              </a:graphicData>
+            </a:graphic>
+          </wp:anchor>
+        </w:drawing>
+      </w:r>
+    </w:p>
+    <w:p>
+      <w:pPr>
+        <w:rPr>
+          <w:rFonts w:asciiTheme="majorBidi" w:hAnsiTheme="majorBidi" w:cstheme="majorBidi"/>
+          <w:b/>
+          <w:bCs/>
+          <w:sz w:val="32"/>
+          <w:szCs w:val="32"/>
+        </w:rPr>
+      </w:pPr>
+    </w:p>
+    <w:p>
+      <w:pPr>
+        <w:rPr>
+          <w:rFonts w:asciiTheme="majorBidi" w:hAnsiTheme="majorBidi" w:cstheme="majorBidi"/>
+          <w:b/>
+          <w:bCs/>
+          <w:sz w:val="32"/>
+          <w:szCs w:val="32"/>
+        </w:rPr>
+      </w:pPr>
+    </w:p>
+    <w:p>
+      <w:pPr>
+        <w:rPr>
+          <w:rFonts w:asciiTheme="majorBidi" w:hAnsiTheme="majorBidi" w:cstheme="majorBidi"/>
+          <w:b/>
+          <w:bCs/>
+          <w:sz w:val="32"/>
+          <w:szCs w:val="32"/>
+        </w:rPr>
+      </w:pPr>
+    </w:p>
+    <w:p>
+      <w:pPr>
+        <w:rPr>
+          <w:rFonts w:asciiTheme="majorBidi" w:hAnsiTheme="majorBidi" w:cstheme="majorBidi"/>
+          <w:b/>
+          <w:bCs/>
+          <w:sz w:val="32"/>
+          <w:szCs w:val="32"/>
+        </w:rPr>
+      </w:pPr>
+    </w:p>
+    <w:p>
+      <w:pPr>
+        <w:rPr>
+          <w:rFonts w:asciiTheme="majorBidi" w:hAnsiTheme="majorBidi" w:cstheme="majorBidi"/>
+          <w:b/>
+          <w:bCs/>
+          <w:sz w:val="32"/>
+          <w:szCs w:val="32"/>
+        </w:rPr>
+      </w:pPr>
+    </w:p>
+    <w:p>
+      <w:pPr>
+        <w:rPr>
+          <w:rFonts w:asciiTheme="majorBidi" w:hAnsiTheme="majorBidi" w:cstheme="majorBidi"/>
+          <w:b/>
+          <w:bCs/>
+          <w:sz w:val="32"/>
+          <w:szCs w:val="32"/>
+        </w:rPr>
+      </w:pPr>
+    </w:p>
+    <w:p>
+      <w:pPr>
+        <w:rPr>
+          <w:rFonts w:asciiTheme="majorBidi" w:hAnsiTheme="majorBidi" w:cstheme="majorBidi"/>
+          <w:b/>
+          <w:bCs/>
+          <w:sz w:val="32"/>
+          <w:szCs w:val="32"/>
+        </w:rPr>
+      </w:pPr>
+    </w:p>
+    <w:p>
+      <w:pPr>
+        <w:rPr>
+          <w:rFonts w:asciiTheme="majorBidi" w:hAnsiTheme="majorBidi" w:cstheme="majorBidi"/>
+          <w:b/>
+          <w:bCs/>
+          <w:sz w:val="32"/>
+          <w:szCs w:val="32"/>
+        </w:rPr>
+      </w:pPr>
+    </w:p>
+    <w:p>
+      <w:pPr>
+        <w:rPr>
+          <w:rFonts w:asciiTheme="majorBidi" w:hAnsiTheme="majorBidi" w:cstheme="majorBidi"/>
+          <w:b/>
+          <w:bCs/>
+          <w:sz w:val="32"/>
+          <w:szCs w:val="32"/>
+        </w:rPr>
+      </w:pPr>
+    </w:p>
+    <w:p>
+      <w:pPr>
+        <w:rPr>
+          <w:rFonts w:asciiTheme="majorBidi" w:hAnsiTheme="majorBidi" w:cstheme="majorBidi"/>
+          <w:b/>
+          <w:bCs/>
+          <w:sz w:val="32"/>
+          <w:szCs w:val="32"/>
+        </w:rPr>
+      </w:pPr>
+    </w:p>
+    <w:p>
+      <w:pPr>
+        <w:rPr>
+          <w:rFonts w:asciiTheme="majorBidi" w:hAnsiTheme="majorBidi" w:cstheme="majorBidi"/>
+          <w:b/>
+          <w:bCs/>
+          <w:sz w:val="32"/>
+          <w:szCs w:val="32"/>
+        </w:rPr>
+      </w:pPr>
+    </w:p>
+    <w:p>
+      <w:pPr>
+        <w:rPr>
+          <w:rFonts w:asciiTheme="majorBidi" w:hAnsiTheme="majorBidi" w:cstheme="majorBidi"/>
+          <w:b/>
+          <w:bCs/>
+          <w:sz w:val="32"/>
+          <w:szCs w:val="32"/>
+        </w:rPr>
+      </w:pPr>
+      <w:r>
+        <w:drawing>
+          <wp:anchor distT="0" distB="0" distL="114300" distR="114300" simplePos="0" relativeHeight="251659264" behindDoc="0" locked="0" layoutInCell="1" allowOverlap="1" wp14:anchorId="65EA6806" wp14:editId="1B6F536C">
+            <wp:simplePos x="0" y="0"/>
+            <wp:positionH relativeFrom="margin">
+              <wp:align>right</wp:align>
+            </wp:positionH>
+            <wp:positionV relativeFrom="paragraph">
+              <wp:posOffset>168275</wp:posOffset>
+            </wp:positionV>
+            <wp:extent cx="5943600" cy="2333625"/>
+            <wp:effectExtent l="0" t="0" r="0" b="0"/>
+            <wp:wrapNone/>
+            <wp:docPr id="1154631564" name="Graphic 4"/>
+            <wp:cNvGraphicFramePr>
+              <a:graphicFrameLocks xmlns:a="http://schemas.openxmlformats.org/drawingml/2006/main" noChangeAspect="1"/>
+            </wp:cNvGraphicFramePr>
+            <a:graphic xmlns:a="http://schemas.openxmlformats.org/drawingml/2006/main">
+              <a:graphicData uri="http://schemas.openxmlformats.org/drawingml/2006/picture">
+                <pic:pic xmlns:pic="http://schemas.openxmlformats.org/drawingml/2006/picture">
+                  <pic:nvPicPr>
+                    <pic:cNvPr id="1154631564" name="Graphic 1154631564"/>
+                    <pic:cNvPicPr/>
+                  </pic:nvPicPr>
+                  <pic:blipFill rotWithShape="1">
+                    <a:blip r:embed="rId22">
+                      <a:extLst>
+                        <a:ext uri="{96DAC541-7B7A-43D3-8B79-37D633B846F1}">
+                          <asvg:svgBlip xmlns:asvg="http://schemas.microsoft.com/office/drawing/2016/SVG/main" r:embed="rId23"/>
+                        </a:ext>
+                      </a:extLst>
+                    </a:blip>
+                    <a:srcRect b="25502"/>
+                    <a:stretch>
+                      <a:fillRect/>
+                    </a:stretch>
+                  </pic:blipFill>
+                  <pic:spPr bwMode="auto">
+                    <a:xfrm>
+                      <a:off x="0" y="0"/>
+                      <a:ext cx="5943600" cy="2333625"/>
+                    </a:xfrm>
+                    <a:prstGeom prst="rect">
+                      <a:avLst/>
+                    </a:prstGeom>
+                    <a:ln>
+                      <a:noFill/>
+                    </a:ln>
+                    <a:extLst>
+                      <a:ext uri="{53640926-AAD7-44D8-BBD7-CCE9431645EC}">
+                        <a14:shadowObscured xmlns:a14="http://schemas.microsoft.com/office/drawing/2010/main"/>
+                      </a:ext>
+                    </a:extLst>
+                  </pic:spPr>
+                </pic:pic>
+              </a:graphicData>
+            </a:graphic>
+          </wp:anchor>
+        </w:drawing>
+      </w:r>
+    </w:p>
+    <w:p>
+      <w:pPr>
+        <w:rPr>
+          <w:rFonts w:asciiTheme="majorBidi" w:hAnsiTheme="majorBidi" w:cstheme="majorBidi"/>
+          <w:b/>
+          <w:bCs/>
+          <w:sz w:val="32"/>
+          <w:szCs w:val="32"/>
+        </w:rPr>
+      </w:pPr>
+    </w:p>
+    <w:p>
+      <w:pPr>
+        <w:rPr>
+          <w:rFonts w:asciiTheme="majorBidi" w:hAnsiTheme="majorBidi" w:cstheme="majorBidi"/>
+          <w:b/>
+          <w:bCs/>
+          <w:sz w:val="32"/>
+          <w:szCs w:val="32"/>
+        </w:rPr>
+      </w:pPr>
+    </w:p>
+    <w:p>
+      <w:pPr>
+        <w:rPr>
+          <w:rFonts w:asciiTheme="majorBidi" w:hAnsiTheme="majorBidi" w:cstheme="majorBidi"/>
+          <w:b/>
+          <w:bCs/>
+          <w:sz w:val="32"/>
+          <w:szCs w:val="32"/>
+        </w:rPr>
+      </w:pPr>
+    </w:p>
+    <w:p>
+      <w:pPr>
+        <w:rPr>
+          <w:rFonts w:asciiTheme="majorBidi" w:hAnsiTheme="majorBidi" w:cstheme="majorBidi"/>
+          <w:b/>
+          <w:bCs/>
+          <w:sz w:val="32"/>
+          <w:szCs w:val="32"/>
+        </w:rPr>
+      </w:pPr>
+    </w:p>
+    <w:p>
+      <w:pPr>
+        <w:rPr>
+          <w:rFonts w:asciiTheme="majorBidi" w:hAnsiTheme="majorBidi" w:cstheme="majorBidi"/>
+          <w:b/>
+          <w:bCs/>
+          <w:sz w:val="32"/>
+          <w:szCs w:val="32"/>
+        </w:rPr>
+      </w:pPr>
+    </w:p>
+    <w:p>
+      <w:pPr>
+        <w:rPr>
+          <w:rFonts w:asciiTheme="majorBidi" w:hAnsiTheme="majorBidi" w:cstheme="majorBidi"/>
+          <w:b/>
+          <w:bCs/>
+          <w:sz w:val="32"/>
+          <w:szCs w:val="32"/>
+        </w:rPr>
+      </w:pPr>
+    </w:p>
+    <w:p>
+      <w:pPr>
+        <w:rPr>
+          <w:rFonts w:asciiTheme="majorBidi" w:hAnsiTheme="majorBidi" w:cstheme="majorBidi"/>
+          <w:b/>
+          <w:bCs/>
+          <w:sz w:val="32"/>
+          <w:szCs w:val="32"/>
+        </w:rPr>
+      </w:pPr>
+    </w:p>
+    <w:p>
+      <w:pPr>
+        <w:rPr>
+          <w:rFonts w:asciiTheme="majorBidi" w:hAnsiTheme="majorBidi" w:cstheme="majorBidi"/>
+          <w:b/>
+          <w:bCs/>
+          <w:sz w:val="32"/>
+          <w:szCs w:val="32"/>
+        </w:rPr>
+      </w:pPr>
+      <w:r>
+        <w:rPr>
+          <w:rFonts w:asciiTheme="majorBidi" w:hAnsiTheme="majorBidi" w:cstheme="majorBidi"/>
+          <w:b/>
+          <w:bCs/>
+          <w:sz w:val="32"/>
+          <w:szCs w:val="32"/>
+        </w:rPr>
+        <w:lastRenderedPageBreak/>
+        <w:t>Deployment Architecture Diagram</w:t>
+      </w:r>
+    </w:p>
+    <w:p>
+      <w:pPr>
+        <w:rPr>
+          <w:rFonts w:asciiTheme="majorBidi" w:hAnsiTheme="majorBidi" w:cstheme="majorBidi"/>
+          <w:b/>
+          <w:bCs/>
+          <w:sz w:val="32"/>
+          <w:szCs w:val="32"/>
+        </w:rPr>
+      </w:pPr>
+      <w:r>
+        <w:rPr>
+          <w:rFonts w:asciiTheme="majorBidi" w:hAnsiTheme="majorBidi" w:cstheme="majorBidi"/>
+          <w:b/>
+          <w:bCs/>
+          <w:noProof/>
+          <w:sz w:val="32"/>
+          <w:szCs w:val="32"/>
+        </w:rPr>
+        <w:drawing>
+          <wp:inline distT="0" distB="0" distL="0" distR="0" wp14:anchorId="27C8EC3E" wp14:editId="042FB9C3">
+            <wp:extent cx="5943600" cy="2514600"/>
+            <wp:effectExtent l="0" t="0" r="0" b="0"/>
+            <wp:docPr id="1535989605" name="Graphic 13"/>
+            <wp:cNvGraphicFramePr>
+              <a:graphicFrameLocks xmlns:a="http://schemas.openxmlformats.org/drawingml/2006/main" noChangeAspect="1"/>
+            </wp:cNvGraphicFramePr>
+            <a:graphic xmlns:a="http://schemas.openxmlformats.org/drawingml/2006/main">
+              <a:graphicData uri="http://schemas.openxmlformats.org/drawingml/2006/picture">
+                <pic:pic xmlns:pic="http://schemas.openxmlformats.org/drawingml/2006/picture">
+                  <pic:nvPicPr>
+                    <pic:cNvPr id="1535989605" name="Graphic 1535989605"/>
+                    <pic:cNvPicPr/>
+                  </pic:nvPicPr>
+                  <pic:blipFill rotWithShape="1">
+                    <a:blip r:embed="rId24">
+                      <a:extLst>
+                        <a:ext uri="{96DAC541-7B7A-43D3-8B79-37D633B846F1}">
+                          <asvg:svgBlip xmlns:asvg="http://schemas.microsoft.com/office/drawing/2016/SVG/main" r:embed="rId25"/>
+                        </a:ext>
+                      </a:extLst>
+                    </a:blip>
+                    <a:srcRect b="10589"/>
+                    <a:stretch>
+                      <a:fillRect/>
+                    </a:stretch>
+                  </pic:blipFill>
+                  <pic:spPr bwMode="auto">
+                    <a:xfrm>
+                      <a:off x="0" y="0"/>
+                      <a:ext cx="5943600" cy="2514600"/>
+                    </a:xfrm>
+                    <a:prstGeom prst="rect">
+                      <a:avLst/>
+                    </a:prstGeom>
+                    <a:ln>
+                      <a:noFill/>
+                    </a:ln>
+                    <a:extLst>
+                      <a:ext uri="{53640926-AAD7-44D8-BBD7-CCE9431645EC}">
+                        <a14:shadowObscured xmlns:a14="http://schemas.microsoft.com/office/drawing/2010/main"/>
+                      </a:ext>
+                    </a:extLst>
+                  </pic:spPr>
+                </pic:pic>
+              </a:graphicData>
+            </a:graphic>
+          </wp:inline>
+        </w:drawing>
+      </w:r>
+    </w:p>
+    <w:p>
+      <w:pPr>
+        <w:rPr>
+          <w:rFonts w:asciiTheme="majorBidi" w:hAnsiTheme="majorBidi" w:cstheme="majorBidi"/>
+          <w:b/>
+          <w:bCs/>
+          <w:sz w:val="32"/>
+          <w:szCs w:val="32"/>
+        </w:rPr>
+      </w:pPr>
+    </w:p>
+    <w:p>
+      <w:pPr>
+        <w:rPr>
+          <w:rFonts w:asciiTheme="majorBidi" w:hAnsiTheme="majorBidi" w:cstheme="majorBidi"/>
+          <w:b/>
+          <w:bCs/>
+          <w:sz w:val="32"/>
+          <w:szCs w:val="32"/>
+        </w:rPr>
+      </w:pPr>
+    </w:p>
+    <w:p>
+      <w:pPr>
+        <w:rPr>
+          <w:rFonts w:asciiTheme="majorBidi" w:hAnsiTheme="majorBidi" w:cstheme="majorBidi"/>
+          <w:b/>
+          <w:bCs/>
+          <w:sz w:val="32"/>
+          <w:szCs w:val="32"/>
+        </w:rPr>
+      </w:pPr>
+    </w:p>
+    <w:p>
+      <w:pPr>
+        <w:rPr>
+          <w:rFonts w:asciiTheme="majorBidi" w:hAnsiTheme="majorBidi" w:cstheme="majorBidi"/>
+          <w:b/>
+          <w:bCs/>
+          <w:sz w:val="32"/>
+          <w:szCs w:val="32"/>
+        </w:rPr>
+      </w:pPr>
+    </w:p>
+    <w:p>
+      <w:pPr>
+        <w:rPr>
+          <w:rFonts w:asciiTheme="majorBidi" w:hAnsiTheme="majorBidi" w:cstheme="majorBidi"/>
+          <w:b/>
+          <w:bCs/>
+          <w:sz w:val="32"/>
+          <w:szCs w:val="32"/>
+        </w:rPr>
+      </w:pPr>
+    </w:p>
+    <w:p>
+      <w:pPr>
+        <w:rPr>
+          <w:rFonts w:asciiTheme="majorBidi" w:hAnsiTheme="majorBidi" w:cstheme="majorBidi"/>
+          <w:b/>
+          <w:bCs/>
+          <w:sz w:val="32"/>
+          <w:szCs w:val="32"/>
+        </w:rPr>
+      </w:pPr>
+    </w:p>
+    <w:p>
+      <w:pPr>
+        <w:rPr>
+          <w:rFonts w:asciiTheme="majorBidi" w:hAnsiTheme="majorBidi" w:cstheme="majorBidi"/>
+          <w:b/>
+          <w:bCs/>
+          <w:sz w:val="32"/>
+          <w:szCs w:val="32"/>
+        </w:rPr>
+      </w:pPr>
+    </w:p>
+    <w:p>
+      <w:pPr>
+        <w:rPr>
+          <w:rFonts w:asciiTheme="majorBidi" w:hAnsiTheme="majorBidi" w:cstheme="majorBidi"/>
+          <w:b/>
+          <w:bCs/>
+          <w:sz w:val="32"/>
+          <w:szCs w:val="32"/>
+        </w:rPr>
+      </w:pPr>
+    </w:p>
+    <w:p>
+      <w:pPr>
+        <w:rPr>
+          <w:rFonts w:asciiTheme="majorBidi" w:hAnsiTheme="majorBidi" w:cstheme="majorBidi"/>
+          <w:b/>
+          <w:bCs/>
+          <w:sz w:val="32"/>
+          <w:szCs w:val="32"/>
+        </w:rPr>
+      </w:pPr>
+    </w:p>
+    <w:p>
+      <w:pPr>
+        <w:rPr>
+          <w:rFonts w:asciiTheme="majorBidi" w:hAnsiTheme="majorBidi" w:cstheme="majorBidi"/>
+          <w:b/>
+          <w:bCs/>
+          <w:sz w:val="32"/>
+          <w:szCs w:val="32"/>
+        </w:rPr>
+      </w:pPr>
+    </w:p>
+    <w:p>
+      <w:pPr>
+        <w:rPr>
+          <w:rFonts w:asciiTheme="majorBidi" w:hAnsiTheme="majorBidi" w:cstheme="majorBidi"/>
+          <w:b/>
+          <w:bCs/>
+          <w:sz w:val="32"/>
+          <w:szCs w:val="32"/>
+        </w:rPr>
+      </w:pPr>
+    </w:p>
+    <w:p>
+      <w:pPr>
+        <w:rPr>
+          <w:rFonts w:asciiTheme="majorBidi" w:hAnsiTheme="majorBidi" w:cstheme="majorBidi"/>
+          <w:b/>
+          <w:bCs/>
+          <w:sz w:val="32"/>
+          <w:szCs w:val="32"/>
+        </w:rPr>
+      </w:pPr>
+    </w:p>
+    <w:p>
+      <w:pPr>
+        <w:rPr>
+          <w:rFonts w:asciiTheme="majorBidi" w:hAnsiTheme="majorBidi" w:cstheme="majorBidi"/>
+          <w:b/>
+          <w:bCs/>
+          <w:sz w:val="32"/>
+          <w:szCs w:val="32"/>
+        </w:rPr>
+      </w:pPr>
+    </w:p>
+    <w:p>
+      <w:pPr>
+        <w:rPr>
+          <w:rFonts w:asciiTheme="majorBidi" w:hAnsiTheme="majorBidi" w:cstheme="majorBidi"/>
+          <w:b/>
+          <w:bCs/>
+          <w:sz w:val="32"/>
+          <w:szCs w:val="32"/>
+        </w:rPr>
+      </w:pPr>
+    </w:p>
+    <w:p>
+      <w:pPr>
+        <w:rPr>
+          <w:rFonts w:asciiTheme="majorBidi" w:hAnsiTheme="majorBidi" w:cstheme="majorBidi"/>
+          <w:b/>
+          <w:bCs/>
+          <w:sz w:val="32"/>
+          <w:szCs w:val="32"/>
+        </w:rPr>
+      </w:pPr>
+    </w:p>
+    <w:p>
+      <w:pPr>
+        <w:rPr>
+          <w:rFonts w:asciiTheme="majorBidi" w:hAnsiTheme="majorBidi" w:cstheme="majorBidi"/>
+          <w:b/>
+          <w:bCs/>
+          <w:sz w:val="32"/>
+          <w:szCs w:val="32"/>
+        </w:rPr>
+      </w:pPr>
+    </w:p>
+    <w:p>
+      <w:pPr>
+        <w:rPr>
+          <w:rFonts w:asciiTheme="majorBidi" w:hAnsiTheme="majorBidi" w:cstheme="majorBidi"/>
+          <w:b/>
+          <w:bCs/>
+          <w:sz w:val="32"/>
+          <w:szCs w:val="32"/>
+        </w:rPr>
+      </w:pPr>
+    </w:p>
+    <w:p>
+      <w:pPr>
+        <w:rPr>
+          <w:rFonts w:asciiTheme="majorBidi" w:hAnsiTheme="majorBidi" w:cstheme="majorBidi"/>
+          <w:b/>
+          <w:bCs/>
+          <w:sz w:val="32"/>
+          <w:szCs w:val="32"/>
+        </w:rPr>
+      </w:pPr>
+    </w:p>
+    <w:p>
+      <w:pPr>
+        <w:rPr>
+          <w:rFonts w:asciiTheme="majorBidi" w:hAnsiTheme="majorBidi" w:cstheme="majorBidi"/>
+          <w:b/>
+          <w:bCs/>
+          <w:sz w:val="32"/>
+          <w:szCs w:val="32"/>
+        </w:rPr>
+      </w:pPr>
+    </w:p>
+    <w:p>
+      <w:pPr>
+        <w:rPr>
+          <w:rFonts w:asciiTheme="majorBidi" w:hAnsiTheme="majorBidi" w:cstheme="majorBidi"/>
+          <w:b/>
+          <w:bCs/>
+          <w:sz w:val="32"/>
+          <w:szCs w:val="32"/>
+        </w:rPr>
+      </w:pPr>
+    </w:p>
+    <w:p>
+      <w:pPr>
+        <w:rPr>
+          <w:rFonts w:asciiTheme="majorBidi" w:hAnsiTheme="majorBidi" w:cstheme="majorBidi"/>
+          <w:b/>
+          <w:bCs/>
+          <w:sz w:val="32"/>
+          <w:szCs w:val="32"/>
+        </w:rPr>
+      </w:pPr>
+    </w:p>
+    <w:p>
+      <w:pPr>
+        <w:rPr>
+          <w:rFonts w:asciiTheme="majorBidi" w:hAnsiTheme="majorBidi" w:cstheme="majorBidi"/>
+          <w:b/>
+          <w:bCs/>
+          <w:sz w:val="32"/>
+          <w:szCs w:val="32"/>
+        </w:rPr>
+      </w:pPr>
+    </w:p>
+    <w:p>
+      <w:pPr>
+        <w:rPr>
+          <w:rFonts w:asciiTheme="majorBidi" w:hAnsiTheme="majorBidi" w:cstheme="majorBidi"/>
+          <w:b/>
+          <w:bCs/>
+          <w:sz w:val="32"/>
+          <w:szCs w:val="32"/>
+        </w:rPr>
+      </w:pPr>
+    </w:p>
+    <w:p>
+      <w:pPr>
+        <w:rPr>
+          <w:rFonts w:asciiTheme="majorBidi" w:hAnsiTheme="majorBidi" w:cstheme="majorBidi"/>
+          <w:b/>
+          <w:bCs/>
+          <w:sz w:val="32"/>
+          <w:szCs w:val="32"/>
+        </w:rPr>
+      </w:pPr>
       <w:r>
         <w:rPr>
           <w:rFonts w:asciiTheme="majorBidi" w:hAnsiTheme="majorBidi" w:cstheme="majorBidi"/>
@@ -1342,7 +3628,6 @@
           <w:sz w:val="28"/>
           <w:szCs w:val="28"/>
         </w:rPr>
-        <w:lastRenderedPageBreak/>
         <w:t>Pros:</w:t>
       </w:r>
     </w:p>
@@ -1575,6 +3860,7 @@
           <w:sz w:val="28"/>
           <w:szCs w:val="28"/>
         </w:rPr>
+        <w:lastRenderedPageBreak/>
         <w:t>Consequences:</w:t>
       </w:r>
     </w:p>
@@ -1961,7 +4247,6 @@
           <w:sz w:val="28"/>
           <w:szCs w:val="28"/>
         </w:rPr>
-        <w:lastRenderedPageBreak/>
         <w:t>Token revocation is harder to manage</w:t>
       </w:r>
     </w:p>
@@ -2045,7 +4330,25 @@
           <w:sz w:val="28"/>
           <w:szCs w:val="28"/>
         </w:rPr>
-        <w:t>Decision: Use modular monolith architecture (microservices-ready).</w:t>
+        <w:t>Decision: Use modular monolith architecture (</w:t>
+      </w:r>
+      <w:proofErr w:type="gramStart"/>
+      <w:r>
+        <w:rPr>
+          <w:rFonts w:asciiTheme="majorBidi" w:hAnsiTheme="majorBidi" w:cstheme="majorBidi"/>
+          <w:sz w:val="28"/>
+          <w:szCs w:val="28"/>
+        </w:rPr>
+        <w:t>microservices-ready</w:t>
+      </w:r>
+      <w:proofErr w:type="gramEnd"/>
+      <w:r>
+        <w:rPr>
+          <w:rFonts w:asciiTheme="majorBidi" w:hAnsiTheme="majorBidi" w:cstheme="majorBidi"/>
+          <w:sz w:val="28"/>
+          <w:szCs w:val="28"/>
+        </w:rPr>
+        <w:t>).</w:t>
       </w:r>
     </w:p>
     <w:p>
@@ -2221,6 +4524,7 @@
           <w:sz w:val="28"/>
           <w:szCs w:val="28"/>
         </w:rPr>
+        <w:lastRenderedPageBreak/>
         <w:t>Risk of tight coupling if not properly designed</w:t>
       </w:r>
     </w:p>
@@ -2537,6 +4841,270 @@
           <w:sz w:val="28"/>
           <w:szCs w:val="28"/>
         </w:rPr>
+        <w:t>Consequences:</w:t>
+      </w:r>
+    </w:p>
+    <w:p>
+      <w:pPr>
+        <w:pStyle w:val="ListParagraph"/>
+        <w:numPr>
+          <w:ilvl w:val="1"/>
+          <w:numId w:val="15"/>
+        </w:numPr>
+        <w:rPr>
+          <w:rFonts w:asciiTheme="majorBidi" w:hAnsiTheme="majorBidi" w:cstheme="majorBidi"/>
+          <w:sz w:val="28"/>
+          <w:szCs w:val="28"/>
+        </w:rPr>
+      </w:pPr>
+      <w:r>
+        <w:rPr>
+          <w:rFonts w:asciiTheme="majorBidi" w:hAnsiTheme="majorBidi" w:cstheme="majorBidi"/>
+          <w:sz w:val="28"/>
+          <w:szCs w:val="28"/>
+        </w:rPr>
+        <w:t>Pros:</w:t>
+      </w:r>
+    </w:p>
+    <w:p>
+      <w:pPr>
+        <w:pStyle w:val="ListParagraph"/>
+        <w:numPr>
+          <w:ilvl w:val="2"/>
+          <w:numId w:val="15"/>
+        </w:numPr>
+        <w:rPr>
+          <w:rFonts w:asciiTheme="majorBidi" w:hAnsiTheme="majorBidi" w:cstheme="majorBidi"/>
+          <w:sz w:val="28"/>
+          <w:szCs w:val="28"/>
+        </w:rPr>
+      </w:pPr>
+      <w:r>
+        <w:rPr>
+          <w:rFonts w:asciiTheme="majorBidi" w:hAnsiTheme="majorBidi" w:cstheme="majorBidi"/>
+          <w:sz w:val="28"/>
+          <w:szCs w:val="28"/>
+        </w:rPr>
+        <w:t>Reduces database load</w:t>
+      </w:r>
+    </w:p>
+    <w:p>
+      <w:pPr>
+        <w:pStyle w:val="ListParagraph"/>
+        <w:numPr>
+          <w:ilvl w:val="2"/>
+          <w:numId w:val="15"/>
+        </w:numPr>
+        <w:rPr>
+          <w:rFonts w:asciiTheme="majorBidi" w:hAnsiTheme="majorBidi" w:cstheme="majorBidi"/>
+          <w:sz w:val="28"/>
+          <w:szCs w:val="28"/>
+        </w:rPr>
+      </w:pPr>
+      <w:r>
+        <w:rPr>
+          <w:rFonts w:asciiTheme="majorBidi" w:hAnsiTheme="majorBidi" w:cstheme="majorBidi"/>
+          <w:sz w:val="28"/>
+          <w:szCs w:val="28"/>
+        </w:rPr>
+        <w:t>Faster response times</w:t>
+      </w:r>
+    </w:p>
+    <w:p>
+      <w:pPr>
+        <w:pStyle w:val="ListParagraph"/>
+        <w:numPr>
+          <w:ilvl w:val="2"/>
+          <w:numId w:val="15"/>
+        </w:numPr>
+        <w:rPr>
+          <w:rFonts w:asciiTheme="majorBidi" w:hAnsiTheme="majorBidi" w:cstheme="majorBidi"/>
+          <w:sz w:val="28"/>
+          <w:szCs w:val="28"/>
+        </w:rPr>
+      </w:pPr>
+      <w:proofErr w:type="gramStart"/>
+      <w:r>
+        <w:rPr>
+          <w:rFonts w:asciiTheme="majorBidi" w:hAnsiTheme="majorBidi" w:cstheme="majorBidi"/>
+          <w:sz w:val="28"/>
+          <w:szCs w:val="28"/>
+        </w:rPr>
+        <w:t>Improves</w:t>
+      </w:r>
+      <w:proofErr w:type="gramEnd"/>
+      <w:r>
+        <w:rPr>
+          <w:rFonts w:asciiTheme="majorBidi" w:hAnsiTheme="majorBidi" w:cstheme="majorBidi"/>
+          <w:sz w:val="28"/>
+          <w:szCs w:val="28"/>
+        </w:rPr>
+        <w:t xml:space="preserve"> scalability</w:t>
+      </w:r>
+    </w:p>
+    <w:p>
+      <w:pPr>
+        <w:pStyle w:val="ListParagraph"/>
+        <w:numPr>
+          <w:ilvl w:val="1"/>
+          <w:numId w:val="15"/>
+        </w:numPr>
+        <w:rPr>
+          <w:rFonts w:asciiTheme="majorBidi" w:hAnsiTheme="majorBidi" w:cstheme="majorBidi"/>
+          <w:sz w:val="28"/>
+          <w:szCs w:val="28"/>
+        </w:rPr>
+      </w:pPr>
+      <w:r>
+        <w:rPr>
+          <w:rFonts w:asciiTheme="majorBidi" w:hAnsiTheme="majorBidi" w:cstheme="majorBidi"/>
+          <w:sz w:val="28"/>
+          <w:szCs w:val="28"/>
+        </w:rPr>
+        <w:t>Cons:</w:t>
+      </w:r>
+    </w:p>
+    <w:p>
+      <w:pPr>
+        <w:pStyle w:val="ListParagraph"/>
+        <w:numPr>
+          <w:ilvl w:val="2"/>
+          <w:numId w:val="15"/>
+        </w:numPr>
+        <w:rPr>
+          <w:rFonts w:asciiTheme="majorBidi" w:hAnsiTheme="majorBidi" w:cstheme="majorBidi"/>
+          <w:sz w:val="28"/>
+          <w:szCs w:val="28"/>
+        </w:rPr>
+      </w:pPr>
+      <w:r>
+        <w:rPr>
+          <w:rFonts w:asciiTheme="majorBidi" w:hAnsiTheme="majorBidi" w:cstheme="majorBidi"/>
+          <w:sz w:val="28"/>
+          <w:szCs w:val="28"/>
+        </w:rPr>
+        <w:t>Adds infrastructure complexity</w:t>
+      </w:r>
+    </w:p>
+    <w:p>
+      <w:pPr>
+        <w:pStyle w:val="ListParagraph"/>
+        <w:numPr>
+          <w:ilvl w:val="2"/>
+          <w:numId w:val="15"/>
+        </w:numPr>
+        <w:rPr>
+          <w:rFonts w:asciiTheme="majorBidi" w:hAnsiTheme="majorBidi" w:cstheme="majorBidi"/>
+          <w:sz w:val="28"/>
+          <w:szCs w:val="28"/>
+        </w:rPr>
+      </w:pPr>
+      <w:r>
+        <w:rPr>
+          <w:rFonts w:asciiTheme="majorBidi" w:hAnsiTheme="majorBidi" w:cstheme="majorBidi"/>
+          <w:sz w:val="28"/>
+          <w:szCs w:val="28"/>
+        </w:rPr>
+        <w:t>Cache invalidation must be handled carefully</w:t>
+      </w:r>
+    </w:p>
+    <w:p>
+      <w:pPr>
+        <w:rPr>
+          <w:rFonts w:asciiTheme="majorBidi" w:hAnsiTheme="majorBidi" w:cstheme="majorBidi"/>
+          <w:sz w:val="28"/>
+          <w:szCs w:val="28"/>
+        </w:rPr>
+      </w:pPr>
+    </w:p>
+    <w:p>
+      <w:pPr>
+        <w:rPr>
+          <w:rFonts w:asciiTheme="majorBidi" w:hAnsiTheme="majorBidi" w:cstheme="majorBidi"/>
+          <w:sz w:val="28"/>
+          <w:szCs w:val="28"/>
+        </w:rPr>
+      </w:pPr>
+      <w:r>
+        <w:rPr>
+          <w:rFonts w:asciiTheme="majorBidi" w:hAnsiTheme="majorBidi" w:cstheme="majorBidi"/>
+          <w:sz w:val="28"/>
+          <w:szCs w:val="28"/>
+        </w:rPr>
+        <w:t>ADR 007: Payment Integration Approach</w:t>
+      </w:r>
+    </w:p>
+    <w:p>
+      <w:pPr>
+        <w:pStyle w:val="ListParagraph"/>
+        <w:numPr>
+          <w:ilvl w:val="0"/>
+          <w:numId w:val="17"/>
+        </w:numPr>
+        <w:rPr>
+          <w:rFonts w:asciiTheme="majorBidi" w:hAnsiTheme="majorBidi" w:cstheme="majorBidi"/>
+          <w:sz w:val="28"/>
+          <w:szCs w:val="28"/>
+        </w:rPr>
+      </w:pPr>
+      <w:r>
+        <w:rPr>
+          <w:rFonts w:asciiTheme="majorBidi" w:hAnsiTheme="majorBidi" w:cstheme="majorBidi"/>
+          <w:sz w:val="28"/>
+          <w:szCs w:val="28"/>
+        </w:rPr>
+        <w:t>Context: The platform requires secure payment handling for bookings.</w:t>
+      </w:r>
+    </w:p>
+    <w:p>
+      <w:pPr>
+        <w:pStyle w:val="ListParagraph"/>
+        <w:numPr>
+          <w:ilvl w:val="0"/>
+          <w:numId w:val="17"/>
+        </w:numPr>
+        <w:rPr>
+          <w:rFonts w:asciiTheme="majorBidi" w:hAnsiTheme="majorBidi" w:cstheme="majorBidi"/>
+          <w:sz w:val="28"/>
+          <w:szCs w:val="28"/>
+        </w:rPr>
+      </w:pPr>
+      <w:r>
+        <w:rPr>
+          <w:rFonts w:asciiTheme="majorBidi" w:hAnsiTheme="majorBidi" w:cstheme="majorBidi"/>
+          <w:sz w:val="28"/>
+          <w:szCs w:val="28"/>
+        </w:rPr>
+        <w:t>Decision: Integrate with an external payment gateway</w:t>
+      </w:r>
+      <w:r>
+        <w:rPr>
+          <w:rFonts w:asciiTheme="majorBidi" w:hAnsiTheme="majorBidi" w:cstheme="majorBidi"/>
+          <w:sz w:val="28"/>
+          <w:szCs w:val="28"/>
+        </w:rPr>
+        <w:t>.</w:t>
+      </w:r>
+    </w:p>
+    <w:p>
+      <w:pPr>
+        <w:pStyle w:val="ListParagraph"/>
+        <w:numPr>
+          <w:ilvl w:val="0"/>
+          <w:numId w:val="17"/>
+        </w:numPr>
+        <w:rPr>
+          <w:rFonts w:asciiTheme="majorBidi" w:hAnsiTheme="majorBidi" w:cstheme="majorBidi"/>
+          <w:sz w:val="28"/>
+          <w:szCs w:val="28"/>
+        </w:rPr>
+      </w:pPr>
+      <w:r>
+        <w:rPr>
+          <w:rFonts w:asciiTheme="majorBidi" w:hAnsiTheme="majorBidi" w:cstheme="majorBidi"/>
+          <w:sz w:val="28"/>
+          <w:szCs w:val="28"/>
+        </w:rPr>
         <w:lastRenderedPageBreak/>
         <w:t>Consequences:</w:t>
       </w:r>
@@ -2546,7 +5114,7 @@
         <w:pStyle w:val="ListParagraph"/>
         <w:numPr>
           <w:ilvl w:val="1"/>
-          <w:numId w:val="15"/>
+          <w:numId w:val="17"/>
         </w:numPr>
         <w:rPr>
           <w:rFonts w:asciiTheme="majorBidi" w:hAnsiTheme="majorBidi" w:cstheme="majorBidi"/>
@@ -2568,21 +5136,21 @@
         <w:pStyle w:val="ListParagraph"/>
         <w:numPr>
           <w:ilvl w:val="2"/>
-          <w:numId w:val="15"/>
-        </w:numPr>
-        <w:rPr>
-          <w:rFonts w:asciiTheme="majorBidi" w:hAnsiTheme="majorBidi" w:cstheme="majorBidi"/>
-          <w:sz w:val="28"/>
-          <w:szCs w:val="28"/>
-        </w:rPr>
-      </w:pPr>
-      <w:r>
-        <w:rPr>
-          <w:rFonts w:asciiTheme="majorBidi" w:hAnsiTheme="majorBidi" w:cstheme="majorBidi"/>
-          <w:sz w:val="28"/>
-          <w:szCs w:val="28"/>
-        </w:rPr>
-        <w:t>Reduces database load</w:t>
+          <w:numId w:val="17"/>
+        </w:numPr>
+        <w:rPr>
+          <w:rFonts w:asciiTheme="majorBidi" w:hAnsiTheme="majorBidi" w:cstheme="majorBidi"/>
+          <w:sz w:val="28"/>
+          <w:szCs w:val="28"/>
+        </w:rPr>
+      </w:pPr>
+      <w:r>
+        <w:rPr>
+          <w:rFonts w:asciiTheme="majorBidi" w:hAnsiTheme="majorBidi" w:cstheme="majorBidi"/>
+          <w:sz w:val="28"/>
+          <w:szCs w:val="28"/>
+        </w:rPr>
+        <w:t>Secure and reliable payment processing</w:t>
       </w:r>
     </w:p>
     <w:p>
@@ -2590,142 +5158,6 @@
         <w:pStyle w:val="ListParagraph"/>
         <w:numPr>
           <w:ilvl w:val="2"/>
-          <w:numId w:val="15"/>
-        </w:numPr>
-        <w:rPr>
-          <w:rFonts w:asciiTheme="majorBidi" w:hAnsiTheme="majorBidi" w:cstheme="majorBidi"/>
-          <w:sz w:val="28"/>
-          <w:szCs w:val="28"/>
-        </w:rPr>
-      </w:pPr>
-      <w:r>
-        <w:rPr>
-          <w:rFonts w:asciiTheme="majorBidi" w:hAnsiTheme="majorBidi" w:cstheme="majorBidi"/>
-          <w:sz w:val="28"/>
-          <w:szCs w:val="28"/>
-        </w:rPr>
-        <w:t>Faster response times</w:t>
-      </w:r>
-    </w:p>
-    <w:p>
-      <w:pPr>
-        <w:pStyle w:val="ListParagraph"/>
-        <w:numPr>
-          <w:ilvl w:val="2"/>
-          <w:numId w:val="15"/>
-        </w:numPr>
-        <w:rPr>
-          <w:rFonts w:asciiTheme="majorBidi" w:hAnsiTheme="majorBidi" w:cstheme="majorBidi"/>
-          <w:sz w:val="28"/>
-          <w:szCs w:val="28"/>
-        </w:rPr>
-      </w:pPr>
-      <w:r>
-        <w:rPr>
-          <w:rFonts w:asciiTheme="majorBidi" w:hAnsiTheme="majorBidi" w:cstheme="majorBidi"/>
-          <w:sz w:val="28"/>
-          <w:szCs w:val="28"/>
-        </w:rPr>
-        <w:t>Improves scalability</w:t>
-      </w:r>
-    </w:p>
-    <w:p>
-      <w:pPr>
-        <w:pStyle w:val="ListParagraph"/>
-        <w:numPr>
-          <w:ilvl w:val="1"/>
-          <w:numId w:val="15"/>
-        </w:numPr>
-        <w:rPr>
-          <w:rFonts w:asciiTheme="majorBidi" w:hAnsiTheme="majorBidi" w:cstheme="majorBidi"/>
-          <w:sz w:val="28"/>
-          <w:szCs w:val="28"/>
-        </w:rPr>
-      </w:pPr>
-      <w:r>
-        <w:rPr>
-          <w:rFonts w:asciiTheme="majorBidi" w:hAnsiTheme="majorBidi" w:cstheme="majorBidi"/>
-          <w:sz w:val="28"/>
-          <w:szCs w:val="28"/>
-        </w:rPr>
-        <w:t>Cons:</w:t>
-      </w:r>
-    </w:p>
-    <w:p>
-      <w:pPr>
-        <w:pStyle w:val="ListParagraph"/>
-        <w:numPr>
-          <w:ilvl w:val="2"/>
-          <w:numId w:val="15"/>
-        </w:numPr>
-        <w:rPr>
-          <w:rFonts w:asciiTheme="majorBidi" w:hAnsiTheme="majorBidi" w:cstheme="majorBidi"/>
-          <w:sz w:val="28"/>
-          <w:szCs w:val="28"/>
-        </w:rPr>
-      </w:pPr>
-      <w:r>
-        <w:rPr>
-          <w:rFonts w:asciiTheme="majorBidi" w:hAnsiTheme="majorBidi" w:cstheme="majorBidi"/>
-          <w:sz w:val="28"/>
-          <w:szCs w:val="28"/>
-        </w:rPr>
-        <w:t>Adds infrastructure complexity</w:t>
-      </w:r>
-    </w:p>
-    <w:p>
-      <w:pPr>
-        <w:pStyle w:val="ListParagraph"/>
-        <w:numPr>
-          <w:ilvl w:val="2"/>
-          <w:numId w:val="15"/>
-        </w:numPr>
-        <w:rPr>
-          <w:rFonts w:asciiTheme="majorBidi" w:hAnsiTheme="majorBidi" w:cstheme="majorBidi"/>
-          <w:sz w:val="28"/>
-          <w:szCs w:val="28"/>
-        </w:rPr>
-      </w:pPr>
-      <w:r>
-        <w:rPr>
-          <w:rFonts w:asciiTheme="majorBidi" w:hAnsiTheme="majorBidi" w:cstheme="majorBidi"/>
-          <w:sz w:val="28"/>
-          <w:szCs w:val="28"/>
-        </w:rPr>
-        <w:t>Cache invalidation must be handled carefully</w:t>
-      </w:r>
-    </w:p>
-    <w:p>
-      <w:pPr>
-        <w:rPr>
-          <w:rFonts w:asciiTheme="majorBidi" w:hAnsiTheme="majorBidi" w:cstheme="majorBidi"/>
-          <w:sz w:val="28"/>
-          <w:szCs w:val="28"/>
-        </w:rPr>
-      </w:pPr>
-    </w:p>
-    <w:p>
-      <w:pPr>
-        <w:rPr>
-          <w:rFonts w:asciiTheme="majorBidi" w:hAnsiTheme="majorBidi" w:cstheme="majorBidi"/>
-          <w:sz w:val="28"/>
-          <w:szCs w:val="28"/>
-        </w:rPr>
-      </w:pPr>
-      <w:r>
-        <w:rPr>
-          <w:rFonts w:asciiTheme="majorBidi" w:hAnsiTheme="majorBidi" w:cstheme="majorBidi"/>
-          <w:sz w:val="28"/>
-          <w:szCs w:val="28"/>
-        </w:rPr>
-        <w:t>ADR 007: Payment Integration Approach</w:t>
-      </w:r>
-    </w:p>
-    <w:p>
-      <w:pPr>
-        <w:pStyle w:val="ListParagraph"/>
-        <w:numPr>
-          <w:ilvl w:val="0"/>
           <w:numId w:val="17"/>
         </w:numPr>
         <w:rPr>
@@ -2740,59 +5172,7 @@
           <w:sz w:val="28"/>
           <w:szCs w:val="28"/>
         </w:rPr>
-        <w:t>Context: The platform requires secure payment handling for bookings.</w:t>
-      </w:r>
-    </w:p>
-    <w:p>
-      <w:pPr>
-        <w:pStyle w:val="ListParagraph"/>
-        <w:numPr>
-          <w:ilvl w:val="0"/>
-          <w:numId w:val="17"/>
-        </w:numPr>
-        <w:rPr>
-          <w:rFonts w:asciiTheme="majorBidi" w:hAnsiTheme="majorBidi" w:cstheme="majorBidi"/>
-          <w:sz w:val="28"/>
-          <w:szCs w:val="28"/>
-        </w:rPr>
-      </w:pPr>
-      <w:r>
-        <w:rPr>
-          <w:rFonts w:asciiTheme="majorBidi" w:hAnsiTheme="majorBidi" w:cstheme="majorBidi"/>
-          <w:sz w:val="28"/>
-          <w:szCs w:val="28"/>
-        </w:rPr>
-        <w:t>Decision: Integrate with an external payment gateway</w:t>
-      </w:r>
-      <w:r>
-        <w:rPr>
-          <w:rFonts w:asciiTheme="majorBidi" w:hAnsiTheme="majorBidi" w:cstheme="majorBidi"/>
-          <w:sz w:val="28"/>
-          <w:szCs w:val="28"/>
-        </w:rPr>
-        <w:t>.</w:t>
-      </w:r>
-    </w:p>
-    <w:p>
-      <w:pPr>
-        <w:pStyle w:val="ListParagraph"/>
-        <w:numPr>
-          <w:ilvl w:val="0"/>
-          <w:numId w:val="17"/>
-        </w:numPr>
-        <w:rPr>
-          <w:rFonts w:asciiTheme="majorBidi" w:hAnsiTheme="majorBidi" w:cstheme="majorBidi"/>
-          <w:sz w:val="28"/>
-          <w:szCs w:val="28"/>
-        </w:rPr>
-      </w:pPr>
-      <w:r>
-        <w:rPr>
-          <w:rFonts w:asciiTheme="majorBidi" w:hAnsiTheme="majorBidi" w:cstheme="majorBidi"/>
-          <w:sz w:val="28"/>
-          <w:szCs w:val="28"/>
-        </w:rPr>
-        <w:t>Consequences:</w:t>
+        <w:t>Reduces development complexity</w:t>
       </w:r>
     </w:p>
     <w:p>
@@ -2814,7 +5194,7 @@
           <w:sz w:val="28"/>
           <w:szCs w:val="28"/>
         </w:rPr>
-        <w:t>Pros:</w:t>
+        <w:t>Cons:</w:t>
       </w:r>
     </w:p>
     <w:p>
@@ -2836,7 +5216,7 @@
           <w:sz w:val="28"/>
           <w:szCs w:val="28"/>
         </w:rPr>
-        <w:t>Secure and reliable payment processing</w:t>
+        <w:t>Dependency on third-party service</w:t>
       </w:r>
     </w:p>
     <w:p>
@@ -2858,72 +5238,6 @@
           <w:sz w:val="28"/>
           <w:szCs w:val="28"/>
         </w:rPr>
-        <w:t>Reduces development complexity</w:t>
-      </w:r>
-    </w:p>
-    <w:p>
-      <w:pPr>
-        <w:pStyle w:val="ListParagraph"/>
-        <w:numPr>
-          <w:ilvl w:val="1"/>
-          <w:numId w:val="17"/>
-        </w:numPr>
-        <w:rPr>
-          <w:rFonts w:asciiTheme="majorBidi" w:hAnsiTheme="majorBidi" w:cstheme="majorBidi"/>
-          <w:sz w:val="28"/>
-          <w:szCs w:val="28"/>
-        </w:rPr>
-      </w:pPr>
-      <w:r>
-        <w:rPr>
-          <w:rFonts w:asciiTheme="majorBidi" w:hAnsiTheme="majorBidi" w:cstheme="majorBidi"/>
-          <w:sz w:val="28"/>
-          <w:szCs w:val="28"/>
-        </w:rPr>
-        <w:t>Cons:</w:t>
-      </w:r>
-    </w:p>
-    <w:p>
-      <w:pPr>
-        <w:pStyle w:val="ListParagraph"/>
-        <w:numPr>
-          <w:ilvl w:val="2"/>
-          <w:numId w:val="17"/>
-        </w:numPr>
-        <w:rPr>
-          <w:rFonts w:asciiTheme="majorBidi" w:hAnsiTheme="majorBidi" w:cstheme="majorBidi"/>
-          <w:sz w:val="28"/>
-          <w:szCs w:val="28"/>
-        </w:rPr>
-      </w:pPr>
-      <w:r>
-        <w:rPr>
-          <w:rFonts w:asciiTheme="majorBidi" w:hAnsiTheme="majorBidi" w:cstheme="majorBidi"/>
-          <w:sz w:val="28"/>
-          <w:szCs w:val="28"/>
-        </w:rPr>
-        <w:t>Dependency on third-party service</w:t>
-      </w:r>
-    </w:p>
-    <w:p>
-      <w:pPr>
-        <w:pStyle w:val="ListParagraph"/>
-        <w:numPr>
-          <w:ilvl w:val="2"/>
-          <w:numId w:val="17"/>
-        </w:numPr>
-        <w:rPr>
-          <w:rFonts w:asciiTheme="majorBidi" w:hAnsiTheme="majorBidi" w:cstheme="majorBidi"/>
-          <w:sz w:val="28"/>
-          <w:szCs w:val="28"/>
-        </w:rPr>
-      </w:pPr>
-      <w:r>
-        <w:rPr>
-          <w:rFonts w:asciiTheme="majorBidi" w:hAnsiTheme="majorBidi" w:cstheme="majorBidi"/>
-          <w:sz w:val="28"/>
-          <w:szCs w:val="28"/>
-        </w:rPr>
         <w:t>Transaction fees apply</w:t>
       </w:r>
     </w:p>
@@ -3187,7 +5501,6 @@
           <w:sz w:val="28"/>
           <w:szCs w:val="28"/>
         </w:rPr>
-        <w:lastRenderedPageBreak/>
         <w:t>ADR 0</w:t>
       </w:r>
       <w:r>
@@ -3428,6 +5741,7 @@
           <w:sz w:val="28"/>
           <w:szCs w:val="28"/>
         </w:rPr>
+        <w:lastRenderedPageBreak/>
         <w:t>ADR 01</w:t>
       </w:r>
       <w:r>
@@ -3716,67 +6030,77 @@
           <w:sz w:val="32"/>
           <w:szCs w:val="32"/>
         </w:rPr>
+        <w:t>API Specifications</w:t>
+      </w:r>
+    </w:p>
+    <w:p>
+      <w:pPr>
+        <w:rPr>
+          <w:rFonts w:asciiTheme="majorBidi" w:hAnsiTheme="majorBidi" w:cstheme="majorBidi"/>
+          <w:sz w:val="28"/>
+          <w:szCs w:val="28"/>
+        </w:rPr>
+      </w:pPr>
+    </w:p>
+    <w:p>
+      <w:pPr>
+        <w:rPr>
+          <w:rFonts w:asciiTheme="majorBidi" w:hAnsiTheme="majorBidi" w:cstheme="majorBidi"/>
+          <w:sz w:val="28"/>
+          <w:szCs w:val="28"/>
+        </w:rPr>
+      </w:pPr>
+      <w:proofErr w:type="spellStart"/>
+      <w:r>
+        <w:rPr>
+          <w:rFonts w:asciiTheme="majorBidi" w:hAnsiTheme="majorBidi" w:cstheme="majorBidi"/>
+          <w:sz w:val="28"/>
+          <w:szCs w:val="28"/>
+        </w:rPr>
+        <w:t>OpenAPI</w:t>
+      </w:r>
+      <w:proofErr w:type="spellEnd"/>
+      <w:r>
+        <w:rPr>
+          <w:rFonts w:asciiTheme="majorBidi" w:hAnsiTheme="majorBidi" w:cstheme="majorBidi"/>
+          <w:sz w:val="28"/>
+          <w:szCs w:val="28"/>
+        </w:rPr>
+        <w:t xml:space="preserve"> </w:t>
+      </w:r>
+      <w:r>
+        <w:rPr>
+          <w:rFonts w:asciiTheme="majorBidi" w:hAnsiTheme="majorBidi" w:cstheme="majorBidi"/>
+          <w:sz w:val="28"/>
+          <w:szCs w:val="28"/>
+        </w:rPr>
+        <w:t>–</w:t>
+      </w:r>
+      <w:r>
+        <w:rPr>
+          <w:rFonts w:asciiTheme="majorBidi" w:hAnsiTheme="majorBidi" w:cstheme="majorBidi"/>
+          <w:sz w:val="28"/>
+          <w:szCs w:val="28"/>
+        </w:rPr>
+        <w:t xml:space="preserve"> Swagger</w:t>
+      </w:r>
+    </w:p>
+    <w:p>
+      <w:pPr>
+        <w:rPr>
+          <w:rFonts w:asciiTheme="majorBidi" w:hAnsiTheme="majorBidi" w:cstheme="majorBidi"/>
+          <w:sz w:val="28"/>
+          <w:szCs w:val="28"/>
+        </w:rPr>
+      </w:pPr>
+      <w:r>
+        <w:rPr>
+          <w:rFonts w:asciiTheme="majorBidi" w:hAnsiTheme="majorBidi" w:cstheme="majorBidi"/>
+          <w:noProof/>
+          <w:sz w:val="28"/>
+          <w:szCs w:val="28"/>
+        </w:rPr>
         <w:lastRenderedPageBreak/>
-        <w:t>API Specifications</w:t>
-      </w:r>
-    </w:p>
-    <w:p>
-      <w:pPr>
-        <w:rPr>
-          <w:rFonts w:asciiTheme="majorBidi" w:hAnsiTheme="majorBidi" w:cstheme="majorBidi"/>
-          <w:sz w:val="28"/>
-          <w:szCs w:val="28"/>
-        </w:rPr>
-      </w:pPr>
-    </w:p>
-    <w:p>
-      <w:pPr>
-        <w:rPr>
-          <w:rFonts w:asciiTheme="majorBidi" w:hAnsiTheme="majorBidi" w:cstheme="majorBidi"/>
-          <w:sz w:val="28"/>
-          <w:szCs w:val="28"/>
-        </w:rPr>
-      </w:pPr>
-      <w:r>
-        <w:rPr>
-          <w:rFonts w:asciiTheme="majorBidi" w:hAnsiTheme="majorBidi" w:cstheme="majorBidi"/>
-          <w:sz w:val="28"/>
-          <w:szCs w:val="28"/>
-        </w:rPr>
-        <w:t xml:space="preserve">OpenAPI </w:t>
-      </w:r>
-      <w:r>
-        <w:rPr>
-          <w:rFonts w:asciiTheme="majorBidi" w:hAnsiTheme="majorBidi" w:cstheme="majorBidi"/>
-          <w:sz w:val="28"/>
-          <w:szCs w:val="28"/>
-        </w:rPr>
-        <w:t>–</w:t>
-      </w:r>
-      <w:r>
-        <w:rPr>
-          <w:rFonts w:asciiTheme="majorBidi" w:hAnsiTheme="majorBidi" w:cstheme="majorBidi"/>
-          <w:sz w:val="28"/>
-          <w:szCs w:val="28"/>
-        </w:rPr>
-        <w:t xml:space="preserve"> Swagger</w:t>
-      </w:r>
-    </w:p>
-    <w:p>
-      <w:pPr>
-        <w:rPr>
-          <w:rFonts w:asciiTheme="majorBidi" w:hAnsiTheme="majorBidi" w:cstheme="majorBidi"/>
-          <w:sz w:val="28"/>
-          <w:szCs w:val="28"/>
-        </w:rPr>
-      </w:pPr>
-      <w:r>
-        <w:rPr>
-          <w:rFonts w:asciiTheme="majorBidi" w:hAnsiTheme="majorBidi" w:cstheme="majorBidi"/>
-          <w:noProof/>
-          <w:sz w:val="28"/>
-          <w:szCs w:val="28"/>
-        </w:rPr>
         <w:drawing>
           <wp:inline distT="0" distB="0" distL="0" distR="0" wp14:anchorId="6511A49B" wp14:editId="422FD92D">
             <wp:extent cx="5943600" cy="4570095"/>
@@ -3793,7 +6117,7 @@
                     <pic:cNvPicPr/>
                   </pic:nvPicPr>
                   <pic:blipFill>
-                    <a:blip r:embed="rId6"/>
+                    <a:blip r:embed="rId26"/>
                     <a:stretch>
                       <a:fillRect/>
                     </a:stretch>
@@ -3981,7 +6305,6 @@
           <w:sz w:val="32"/>
           <w:szCs w:val="32"/>
         </w:rPr>
-        <w:lastRenderedPageBreak/>
         <w:t>Resilience Strategies</w:t>
       </w:r>
     </w:p>
@@ -4038,6 +6361,7 @@
           <w:sz w:val="28"/>
           <w:szCs w:val="28"/>
         </w:rPr>
+        <w:lastRenderedPageBreak/>
         <w:t>Circuit Breaker</w:t>
       </w:r>
     </w:p>
@@ -4275,7 +6599,7 @@
           <w:rtl/>
         </w:rPr>
       </w:pPr>
-      <w:hyperlink r:id="rId7" w:history="1">
+      <w:hyperlink r:id="rId27" w:history="1">
         <w:r>
           <w:rPr>
             <w:rStyle w:val="Hyperlink"/>
@@ -4283,7 +6607,27 @@
             <w:sz w:val="28"/>
             <w:szCs w:val="28"/>
           </w:rPr>
-          <w:t>https://drive.google.com/file/d/1h0uHPd--ArVdo70DL1T3GQsEp3BLzsYa/view?usp=sharing</w:t>
+          <w:t>https://drive.google.com/file/d/1h0uHPd--ArVdo70DL1T3GQsEp3BLzsYa/</w:t>
+        </w:r>
+        <w:proofErr w:type="spellStart"/>
+        <w:r>
+          <w:rPr>
+            <w:rStyle w:val="Hyperlink"/>
+            <w:rFonts w:asciiTheme="majorBidi" w:hAnsiTheme="majorBidi" w:cstheme="majorBidi"/>
+            <w:sz w:val="28"/>
+            <w:szCs w:val="28"/>
+          </w:rPr>
+          <w:t>view?usp</w:t>
+        </w:r>
+        <w:proofErr w:type="spellEnd"/>
+        <w:r>
+          <w:rPr>
+            <w:rStyle w:val="Hyperlink"/>
+            <w:rFonts w:asciiTheme="majorBidi" w:hAnsiTheme="majorBidi" w:cstheme="majorBidi"/>
+            <w:sz w:val="28"/>
+            <w:szCs w:val="28"/>
+          </w:rPr>
+          <w:t>=sharing</w:t>
         </w:r>
       </w:hyperlink>
       <w:r>
@@ -4325,7 +6669,7 @@
           <w:szCs w:val="28"/>
         </w:rPr>
       </w:pPr>
-      <w:hyperlink r:id="rId8" w:history="1">
+      <w:hyperlink r:id="rId28" w:history="1">
         <w:r>
           <w:rPr>
             <w:rStyle w:val="Hyperlink"/>
@@ -7369,7 +9713,6 @@
   <w:style w:type="character" w:default="1" w:styleId="DefaultParagraphFont">
     <w:name w:val="Default Paragraph Font"/>
     <w:uiPriority w:val="1"/>
-    <w:semiHidden/>
     <w:unhideWhenUsed/>
   </w:style>
   <w:style w:type="table" w:default="1" w:styleId="TableNormal">

</xml_diff>